<commit_message>
Removed D3D12 FlightDemo technical note
</commit_message>
<xml_diff>
--- a/content/(Do Not Open)/Template/Chaewan_Woo_Resume_Kor.docx
+++ b/content/(Do Not Open)/Template/Chaewan_Woo_Resume_Kor.docx
@@ -798,8 +798,6 @@
         </w:rPr>
         <w:t xml:space="preserve"> </w:t>
       </w:r>
-      <w:bookmarkStart w:id="1" w:name="_GoBack"/>
-      <w:bookmarkEnd w:id="1"/>
       <w:r>
         <w:rPr>
           <w:rFonts w:ascii="Times New Roman" w:eastAsia="바탕" w:hAnsi="Times New Roman" w:cs="Times New Roman" w:hint="eastAsia"/>
@@ -1563,7 +1561,16 @@
           <w:sz w:val="20"/>
           <w:lang w:eastAsia="ko-KR"/>
         </w:rPr>
-        <w:t>May. 2026 – Present</w:t>
+        <w:t xml:space="preserve">May. 2026 – </w:t>
+      </w:r>
+      <w:r>
+        <w:rPr>
+          <w:rFonts w:ascii="Times New Roman" w:eastAsia="바탕" w:hAnsi="Times New Roman" w:cs="Times New Roman"/>
+          <w:i/>
+          <w:sz w:val="20"/>
+          <w:lang w:eastAsia="ko-KR"/>
+        </w:rPr>
+        <w:t>Sep. 2026</w:t>
       </w:r>
     </w:p>
     <w:p>
@@ -1579,7 +1586,7 @@
         <w:spacing w:before="0" w:after="24" w:line="220" w:lineRule="exact"/>
         <w:ind w:left="697" w:hanging="187"/>
         <w:rPr>
-          <w:rFonts w:ascii="Times New Roman" w:eastAsia="바탕" w:hAnsi="Times New Roman" w:cs="Times New Roman"/>
+          <w:rFonts w:ascii="Times New Roman" w:eastAsia="바탕" w:hAnsi="Times New Roman" w:cs="Times New Roman" w:hint="eastAsia"/>
           <w:i/>
           <w:sz w:val="12"/>
           <w:lang w:eastAsia="ko-KR"/>
@@ -1592,303 +1599,6 @@
           <w:szCs w:val="18"/>
           <w:lang w:eastAsia="ko-KR"/>
         </w:rPr>
-        <w:t>P</w:t>
-      </w:r>
-      <w:r>
-        <w:rPr>
-          <w:rFonts w:ascii="Times New Roman" w:eastAsia="바탕" w:hAnsi="Times New Roman" w:cs="Times New Roman"/>
-          <w:sz w:val="18"/>
-          <w:szCs w:val="18"/>
-          <w:lang w:eastAsia="ko-KR"/>
-        </w:rPr>
-        <w:t>lay</w:t>
-      </w:r>
-      <w:r>
-        <w:rPr>
-          <w:rFonts w:ascii="Times New Roman" w:eastAsia="바탕" w:hAnsi="Times New Roman" w:cs="Times New Roman"/>
-          <w:sz w:val="18"/>
-          <w:szCs w:val="18"/>
-          <w:lang w:eastAsia="ko-KR"/>
-        </w:rPr>
-        <w:t>X4</w:t>
-      </w:r>
-      <w:r>
-        <w:rPr>
-          <w:rFonts w:ascii="Times New Roman" w:eastAsia="바탕" w:hAnsi="Times New Roman" w:cs="Times New Roman"/>
-          <w:sz w:val="18"/>
-          <w:szCs w:val="18"/>
-          <w:lang w:eastAsia="ko-KR"/>
-        </w:rPr>
-        <w:t>에서</w:t>
-      </w:r>
-      <w:r>
-        <w:rPr>
-          <w:rFonts w:ascii="Times New Roman" w:eastAsia="바탕" w:hAnsi="Times New Roman" w:cs="Times New Roman"/>
-          <w:sz w:val="18"/>
-          <w:szCs w:val="18"/>
-          <w:lang w:eastAsia="ko-KR"/>
-        </w:rPr>
-        <w:t xml:space="preserve"> ‘</w:t>
-      </w:r>
-      <w:r>
-        <w:rPr>
-          <w:rFonts w:ascii="Times New Roman" w:eastAsia="바탕" w:hAnsi="Times New Roman" w:cs="Times New Roman" w:hint="eastAsia"/>
-          <w:sz w:val="18"/>
-          <w:szCs w:val="18"/>
-          <w:lang w:eastAsia="ko-KR"/>
-        </w:rPr>
-        <w:t>S</w:t>
-      </w:r>
-      <w:r>
-        <w:rPr>
-          <w:rFonts w:ascii="Times New Roman" w:eastAsia="바탕" w:hAnsi="Times New Roman" w:cs="Times New Roman"/>
-          <w:sz w:val="18"/>
-          <w:szCs w:val="18"/>
-          <w:lang w:eastAsia="ko-KR"/>
-        </w:rPr>
-        <w:t xml:space="preserve">torm Striker’ </w:t>
-      </w:r>
-      <w:r>
-        <w:rPr>
-          <w:rFonts w:ascii="Times New Roman" w:eastAsia="바탕" w:hAnsi="Times New Roman" w:cs="Times New Roman"/>
-          <w:sz w:val="18"/>
-          <w:szCs w:val="18"/>
-          <w:lang w:eastAsia="ko-KR"/>
-        </w:rPr>
-        <w:t>부스의</w:t>
-      </w:r>
-      <w:r>
-        <w:rPr>
-          <w:rFonts w:ascii="Times New Roman" w:eastAsia="바탕" w:hAnsi="Times New Roman" w:cs="Times New Roman"/>
-          <w:sz w:val="18"/>
-          <w:szCs w:val="18"/>
-          <w:lang w:eastAsia="ko-KR"/>
-        </w:rPr>
-        <w:t xml:space="preserve"> </w:t>
-      </w:r>
-      <w:r>
-        <w:rPr>
-          <w:rFonts w:ascii="Times New Roman" w:eastAsia="바탕" w:hAnsi="Times New Roman" w:cs="Times New Roman"/>
-          <w:sz w:val="18"/>
-          <w:szCs w:val="18"/>
-          <w:lang w:eastAsia="ko-KR"/>
-        </w:rPr>
-        <w:t>콘텐츠</w:t>
-      </w:r>
-      <w:r>
-        <w:rPr>
-          <w:rFonts w:ascii="Times New Roman" w:eastAsia="바탕" w:hAnsi="Times New Roman" w:cs="Times New Roman"/>
-          <w:sz w:val="18"/>
-          <w:szCs w:val="18"/>
-          <w:lang w:eastAsia="ko-KR"/>
-        </w:rPr>
-        <w:t xml:space="preserve"> </w:t>
-      </w:r>
-      <w:r>
-        <w:rPr>
-          <w:rFonts w:ascii="Times New Roman" w:eastAsia="바탕" w:hAnsi="Times New Roman" w:cs="Times New Roman"/>
-          <w:sz w:val="18"/>
-          <w:szCs w:val="18"/>
-          <w:lang w:eastAsia="ko-KR"/>
-        </w:rPr>
-        <w:t>기획</w:t>
-      </w:r>
-      <w:r>
-        <w:rPr>
-          <w:rFonts w:ascii="Times New Roman" w:eastAsia="바탕" w:hAnsi="Times New Roman" w:cs="Times New Roman"/>
-          <w:sz w:val="18"/>
-          <w:szCs w:val="18"/>
-          <w:lang w:eastAsia="ko-KR"/>
-        </w:rPr>
-        <w:t xml:space="preserve">, </w:t>
-      </w:r>
-      <w:r>
-        <w:rPr>
-          <w:rFonts w:ascii="Times New Roman" w:eastAsia="바탕" w:hAnsi="Times New Roman" w:cs="Times New Roman"/>
-          <w:sz w:val="18"/>
-          <w:szCs w:val="18"/>
-          <w:lang w:eastAsia="ko-KR"/>
-        </w:rPr>
-        <w:t>참여</w:t>
-      </w:r>
-      <w:r>
-        <w:rPr>
-          <w:rFonts w:ascii="Times New Roman" w:eastAsia="바탕" w:hAnsi="Times New Roman" w:cs="Times New Roman"/>
-          <w:sz w:val="18"/>
-          <w:szCs w:val="18"/>
-          <w:lang w:eastAsia="ko-KR"/>
-        </w:rPr>
-        <w:t xml:space="preserve"> </w:t>
-      </w:r>
-      <w:r>
-        <w:rPr>
-          <w:rFonts w:ascii="Times New Roman" w:eastAsia="바탕" w:hAnsi="Times New Roman" w:cs="Times New Roman"/>
-          <w:sz w:val="18"/>
-          <w:szCs w:val="18"/>
-          <w:lang w:eastAsia="ko-KR"/>
-        </w:rPr>
-        <w:t>동선</w:t>
-      </w:r>
-      <w:r>
-        <w:rPr>
-          <w:rFonts w:ascii="Times New Roman" w:eastAsia="바탕" w:hAnsi="Times New Roman" w:cs="Times New Roman"/>
-          <w:sz w:val="18"/>
-          <w:szCs w:val="18"/>
-          <w:lang w:eastAsia="ko-KR"/>
-        </w:rPr>
-        <w:t xml:space="preserve">, </w:t>
-      </w:r>
-      <w:r>
-        <w:rPr>
-          <w:rFonts w:ascii="Times New Roman" w:eastAsia="바탕" w:hAnsi="Times New Roman" w:cs="Times New Roman"/>
-          <w:sz w:val="18"/>
-          <w:szCs w:val="18"/>
-          <w:lang w:eastAsia="ko-KR"/>
-        </w:rPr>
-        <w:t>인력</w:t>
-      </w:r>
-      <w:r>
-        <w:rPr>
-          <w:rFonts w:ascii="Times New Roman" w:eastAsia="바탕" w:hAnsi="Times New Roman" w:cs="Times New Roman"/>
-          <w:sz w:val="18"/>
-          <w:szCs w:val="18"/>
-          <w:lang w:eastAsia="ko-KR"/>
-        </w:rPr>
-        <w:t xml:space="preserve"> </w:t>
-      </w:r>
-      <w:r>
-        <w:rPr>
-          <w:rFonts w:ascii="Times New Roman" w:eastAsia="바탕" w:hAnsi="Times New Roman" w:cs="Times New Roman"/>
-          <w:sz w:val="18"/>
-          <w:szCs w:val="18"/>
-          <w:lang w:eastAsia="ko-KR"/>
-        </w:rPr>
-        <w:t>배치</w:t>
-      </w:r>
-      <w:r>
-        <w:rPr>
-          <w:rFonts w:ascii="Times New Roman" w:eastAsia="바탕" w:hAnsi="Times New Roman" w:cs="Times New Roman"/>
-          <w:sz w:val="18"/>
-          <w:szCs w:val="18"/>
-          <w:lang w:eastAsia="ko-KR"/>
-        </w:rPr>
-        <w:t xml:space="preserve">, </w:t>
-      </w:r>
-      <w:r>
-        <w:rPr>
-          <w:rFonts w:ascii="Times New Roman" w:eastAsia="바탕" w:hAnsi="Times New Roman" w:cs="Times New Roman"/>
-          <w:sz w:val="18"/>
-          <w:szCs w:val="18"/>
-          <w:lang w:eastAsia="ko-KR"/>
-        </w:rPr>
-        <w:t>이벤트</w:t>
-      </w:r>
-      <w:r>
-        <w:rPr>
-          <w:rFonts w:ascii="Times New Roman" w:eastAsia="바탕" w:hAnsi="Times New Roman" w:cs="Times New Roman"/>
-          <w:sz w:val="18"/>
-          <w:szCs w:val="18"/>
-          <w:lang w:eastAsia="ko-KR"/>
-        </w:rPr>
-        <w:t xml:space="preserve"> </w:t>
-      </w:r>
-      <w:r>
-        <w:rPr>
-          <w:rFonts w:ascii="Times New Roman" w:eastAsia="바탕" w:hAnsi="Times New Roman" w:cs="Times New Roman"/>
-          <w:sz w:val="18"/>
-          <w:szCs w:val="18"/>
-          <w:lang w:eastAsia="ko-KR"/>
-        </w:rPr>
-        <w:t>진행</w:t>
-      </w:r>
-      <w:r>
-        <w:rPr>
-          <w:rFonts w:ascii="Times New Roman" w:eastAsia="바탕" w:hAnsi="Times New Roman" w:cs="Times New Roman"/>
-          <w:sz w:val="18"/>
-          <w:szCs w:val="18"/>
-          <w:lang w:eastAsia="ko-KR"/>
-        </w:rPr>
-        <w:t xml:space="preserve"> </w:t>
-      </w:r>
-      <w:r>
-        <w:rPr>
-          <w:rFonts w:ascii="Times New Roman" w:eastAsia="바탕" w:hAnsi="Times New Roman" w:cs="Times New Roman"/>
-          <w:sz w:val="18"/>
-          <w:szCs w:val="18"/>
-          <w:lang w:eastAsia="ko-KR"/>
-        </w:rPr>
-        <w:t>및</w:t>
-      </w:r>
-      <w:r>
-        <w:rPr>
-          <w:rFonts w:ascii="Times New Roman" w:eastAsia="바탕" w:hAnsi="Times New Roman" w:cs="Times New Roman"/>
-          <w:sz w:val="18"/>
-          <w:szCs w:val="18"/>
-          <w:lang w:eastAsia="ko-KR"/>
-        </w:rPr>
-        <w:t xml:space="preserve"> </w:t>
-      </w:r>
-      <w:r>
-        <w:rPr>
-          <w:rFonts w:ascii="Times New Roman" w:eastAsia="바탕" w:hAnsi="Times New Roman" w:cs="Times New Roman"/>
-          <w:sz w:val="18"/>
-          <w:szCs w:val="18"/>
-          <w:lang w:eastAsia="ko-KR"/>
-        </w:rPr>
-        <w:t>현장</w:t>
-      </w:r>
-      <w:r>
-        <w:rPr>
-          <w:rFonts w:ascii="Times New Roman" w:eastAsia="바탕" w:hAnsi="Times New Roman" w:cs="Times New Roman"/>
-          <w:sz w:val="18"/>
-          <w:szCs w:val="18"/>
-          <w:lang w:eastAsia="ko-KR"/>
-        </w:rPr>
-        <w:t xml:space="preserve"> </w:t>
-      </w:r>
-      <w:r>
-        <w:rPr>
-          <w:rFonts w:ascii="Times New Roman" w:eastAsia="바탕" w:hAnsi="Times New Roman" w:cs="Times New Roman"/>
-          <w:sz w:val="18"/>
-          <w:szCs w:val="18"/>
-          <w:lang w:eastAsia="ko-KR"/>
-        </w:rPr>
-        <w:t>이슈</w:t>
-      </w:r>
-      <w:r>
-        <w:rPr>
-          <w:rFonts w:ascii="Times New Roman" w:eastAsia="바탕" w:hAnsi="Times New Roman" w:cs="Times New Roman"/>
-          <w:sz w:val="18"/>
-          <w:szCs w:val="18"/>
-          <w:lang w:eastAsia="ko-KR"/>
-        </w:rPr>
-        <w:t xml:space="preserve"> </w:t>
-      </w:r>
-      <w:r>
-        <w:rPr>
-          <w:rFonts w:ascii="Times New Roman" w:eastAsia="바탕" w:hAnsi="Times New Roman" w:cs="Times New Roman"/>
-          <w:sz w:val="18"/>
-          <w:szCs w:val="18"/>
-          <w:lang w:eastAsia="ko-KR"/>
-        </w:rPr>
-        <w:t>대응까지</w:t>
-      </w:r>
-      <w:r>
-        <w:rPr>
-          <w:rFonts w:ascii="Times New Roman" w:eastAsia="바탕" w:hAnsi="Times New Roman" w:cs="Times New Roman"/>
-          <w:sz w:val="18"/>
-          <w:szCs w:val="18"/>
-          <w:lang w:eastAsia="ko-KR"/>
-        </w:rPr>
-        <w:t xml:space="preserve"> </w:t>
-      </w:r>
-      <w:r>
-        <w:rPr>
-          <w:rFonts w:ascii="Times New Roman" w:eastAsia="바탕" w:hAnsi="Times New Roman" w:cs="Times New Roman"/>
-          <w:sz w:val="18"/>
-          <w:szCs w:val="18"/>
-          <w:lang w:eastAsia="ko-KR"/>
-        </w:rPr>
         <w:t>운영</w:t>
       </w:r>
       <w:r>
@@ -1907,25 +1617,250 @@
           <w:szCs w:val="18"/>
           <w:lang w:eastAsia="ko-KR"/>
         </w:rPr>
-        <w:t>전반</w:t>
-      </w:r>
-      <w:r>
-        <w:rPr>
-          <w:rFonts w:ascii="Times New Roman" w:eastAsia="바탕" w:hAnsi="Times New Roman" w:cs="Times New Roman"/>
-          <w:sz w:val="18"/>
-          <w:szCs w:val="18"/>
-          <w:lang w:eastAsia="ko-KR"/>
-        </w:rPr>
-        <w:t xml:space="preserve"> </w:t>
-      </w:r>
-      <w:r>
-        <w:rPr>
-          <w:rFonts w:ascii="Times New Roman" w:eastAsia="바탕" w:hAnsi="Times New Roman" w:cs="Times New Roman"/>
-          <w:sz w:val="18"/>
-          <w:szCs w:val="18"/>
-          <w:lang w:eastAsia="ko-KR"/>
-        </w:rPr>
-        <w:t>총괄</w:t>
+        <w:t>전략을</w:t>
+      </w:r>
+      <w:r>
+        <w:rPr>
+          <w:rFonts w:ascii="Times New Roman" w:eastAsia="바탕" w:hAnsi="Times New Roman" w:cs="Times New Roman"/>
+          <w:sz w:val="18"/>
+          <w:szCs w:val="18"/>
+          <w:lang w:eastAsia="ko-KR"/>
+        </w:rPr>
+        <w:t xml:space="preserve"> </w:t>
+      </w:r>
+      <w:r>
+        <w:rPr>
+          <w:rFonts w:ascii="Times New Roman" w:eastAsia="바탕" w:hAnsi="Times New Roman" w:cs="Times New Roman"/>
+          <w:sz w:val="18"/>
+          <w:szCs w:val="18"/>
+          <w:lang w:eastAsia="ko-KR"/>
+        </w:rPr>
+        <w:t>주도하여</w:t>
+      </w:r>
+      <w:r>
+        <w:rPr>
+          <w:rFonts w:ascii="Times New Roman" w:eastAsia="바탕" w:hAnsi="Times New Roman" w:cs="Times New Roman"/>
+          <w:sz w:val="18"/>
+          <w:szCs w:val="18"/>
+          <w:lang w:eastAsia="ko-KR"/>
+        </w:rPr>
+        <w:t xml:space="preserve"> </w:t>
+      </w:r>
+      <w:r>
+        <w:rPr>
+          <w:rFonts w:ascii="Times New Roman" w:eastAsia="바탕" w:hAnsi="Times New Roman" w:cs="Times New Roman"/>
+          <w:sz w:val="18"/>
+          <w:szCs w:val="18"/>
+          <w:lang w:eastAsia="ko-KR"/>
+        </w:rPr>
+        <w:t>입사</w:t>
+      </w:r>
+      <w:r>
+        <w:rPr>
+          <w:rFonts w:ascii="Times New Roman" w:eastAsia="바탕" w:hAnsi="Times New Roman" w:cs="Times New Roman"/>
+          <w:sz w:val="18"/>
+          <w:szCs w:val="18"/>
+          <w:lang w:eastAsia="ko-KR"/>
+        </w:rPr>
+        <w:t xml:space="preserve"> </w:t>
+      </w:r>
+      <w:r>
+        <w:rPr>
+          <w:rFonts w:ascii="Times New Roman" w:eastAsia="바탕" w:hAnsi="Times New Roman" w:cs="Times New Roman"/>
+          <w:sz w:val="18"/>
+          <w:szCs w:val="18"/>
+          <w:lang w:eastAsia="ko-KR"/>
+        </w:rPr>
+        <w:t>4</w:t>
+      </w:r>
+      <w:r>
+        <w:rPr>
+          <w:rFonts w:ascii="Times New Roman" w:eastAsia="바탕" w:hAnsi="Times New Roman" w:cs="Times New Roman"/>
+          <w:sz w:val="18"/>
+          <w:szCs w:val="18"/>
+          <w:lang w:eastAsia="ko-KR"/>
+        </w:rPr>
+        <w:t>개월</w:t>
+      </w:r>
+      <w:r>
+        <w:rPr>
+          <w:rFonts w:ascii="Times New Roman" w:eastAsia="바탕" w:hAnsi="Times New Roman" w:cs="Times New Roman"/>
+          <w:sz w:val="18"/>
+          <w:szCs w:val="18"/>
+          <w:lang w:eastAsia="ko-KR"/>
+        </w:rPr>
+        <w:t xml:space="preserve"> </w:t>
+      </w:r>
+      <w:r>
+        <w:rPr>
+          <w:rFonts w:ascii="Times New Roman" w:eastAsia="바탕" w:hAnsi="Times New Roman" w:cs="Times New Roman"/>
+          <w:sz w:val="18"/>
+          <w:szCs w:val="18"/>
+          <w:lang w:eastAsia="ko-KR"/>
+        </w:rPr>
+        <w:t>만에</w:t>
+      </w:r>
+      <w:r>
+        <w:rPr>
+          <w:rFonts w:ascii="Times New Roman" w:eastAsia="바탕" w:hAnsi="Times New Roman" w:cs="Times New Roman"/>
+          <w:sz w:val="18"/>
+          <w:szCs w:val="18"/>
+          <w:lang w:eastAsia="ko-KR"/>
+        </w:rPr>
+        <w:t xml:space="preserve"> </w:t>
+      </w:r>
+      <w:r>
+        <w:rPr>
+          <w:rFonts w:ascii="Times New Roman" w:eastAsia="바탕" w:hAnsi="Times New Roman" w:cs="Times New Roman"/>
+          <w:sz w:val="18"/>
+          <w:szCs w:val="18"/>
+          <w:lang w:eastAsia="ko-KR"/>
+        </w:rPr>
+        <w:t>약</w:t>
+      </w:r>
+      <w:r>
+        <w:rPr>
+          <w:rFonts w:ascii="Times New Roman" w:eastAsia="바탕" w:hAnsi="Times New Roman" w:cs="Times New Roman"/>
+          <w:sz w:val="18"/>
+          <w:szCs w:val="18"/>
+          <w:lang w:eastAsia="ko-KR"/>
+        </w:rPr>
+        <w:t xml:space="preserve"> 3</w:t>
+      </w:r>
+      <w:r>
+        <w:rPr>
+          <w:rFonts w:ascii="Times New Roman" w:eastAsia="바탕" w:hAnsi="Times New Roman" w:cs="Times New Roman"/>
+          <w:sz w:val="18"/>
+          <w:szCs w:val="18"/>
+          <w:lang w:eastAsia="ko-KR"/>
+        </w:rPr>
+        <w:t>년간</w:t>
+      </w:r>
+      <w:r>
+        <w:rPr>
+          <w:rFonts w:ascii="Times New Roman" w:eastAsia="바탕" w:hAnsi="Times New Roman" w:cs="Times New Roman"/>
+          <w:sz w:val="18"/>
+          <w:szCs w:val="18"/>
+          <w:lang w:eastAsia="ko-KR"/>
+        </w:rPr>
+        <w:t xml:space="preserve"> </w:t>
+      </w:r>
+      <w:r>
+        <w:rPr>
+          <w:rFonts w:ascii="Times New Roman" w:eastAsia="바탕" w:hAnsi="Times New Roman" w:cs="Times New Roman"/>
+          <w:sz w:val="18"/>
+          <w:szCs w:val="18"/>
+          <w:lang w:eastAsia="ko-KR"/>
+        </w:rPr>
+        <w:t>이어진</w:t>
+      </w:r>
+      <w:r>
+        <w:rPr>
+          <w:rFonts w:ascii="Times New Roman" w:eastAsia="바탕" w:hAnsi="Times New Roman" w:cs="Times New Roman"/>
+          <w:sz w:val="18"/>
+          <w:szCs w:val="18"/>
+          <w:lang w:eastAsia="ko-KR"/>
+        </w:rPr>
+        <w:t xml:space="preserve"> </w:t>
+      </w:r>
+      <w:r>
+        <w:rPr>
+          <w:rFonts w:ascii="Times New Roman" w:eastAsia="바탕" w:hAnsi="Times New Roman" w:cs="Times New Roman"/>
+          <w:sz w:val="18"/>
+          <w:szCs w:val="18"/>
+          <w:lang w:eastAsia="ko-KR"/>
+        </w:rPr>
+        <w:t>게임</w:t>
+      </w:r>
+      <w:r>
+        <w:rPr>
+          <w:rFonts w:ascii="Times New Roman" w:eastAsia="바탕" w:hAnsi="Times New Roman" w:cs="Times New Roman"/>
+          <w:sz w:val="18"/>
+          <w:szCs w:val="18"/>
+          <w:lang w:eastAsia="ko-KR"/>
+        </w:rPr>
+        <w:t xml:space="preserve"> </w:t>
+      </w:r>
+      <w:r>
+        <w:rPr>
+          <w:rFonts w:ascii="Times New Roman" w:eastAsia="바탕" w:hAnsi="Times New Roman" w:cs="Times New Roman"/>
+          <w:sz w:val="18"/>
+          <w:szCs w:val="18"/>
+          <w:lang w:eastAsia="ko-KR"/>
+        </w:rPr>
+        <w:t>서비스의</w:t>
+      </w:r>
+      <w:r>
+        <w:rPr>
+          <w:rFonts w:ascii="Times New Roman" w:eastAsia="바탕" w:hAnsi="Times New Roman" w:cs="Times New Roman"/>
+          <w:sz w:val="18"/>
+          <w:szCs w:val="18"/>
+          <w:lang w:eastAsia="ko-KR"/>
+        </w:rPr>
+        <w:t xml:space="preserve"> </w:t>
+      </w:r>
+      <w:r>
+        <w:rPr>
+          <w:rFonts w:ascii="Times New Roman" w:eastAsia="바탕" w:hAnsi="Times New Roman" w:cs="Times New Roman"/>
+          <w:sz w:val="18"/>
+          <w:szCs w:val="18"/>
+          <w:lang w:eastAsia="ko-KR"/>
+        </w:rPr>
+        <w:t>최고</w:t>
+      </w:r>
+      <w:r>
+        <w:rPr>
+          <w:rFonts w:ascii="Times New Roman" w:eastAsia="바탕" w:hAnsi="Times New Roman" w:cs="Times New Roman"/>
+          <w:sz w:val="18"/>
+          <w:szCs w:val="18"/>
+          <w:lang w:eastAsia="ko-KR"/>
+        </w:rPr>
+        <w:t xml:space="preserve"> </w:t>
+      </w:r>
+      <w:r>
+        <w:rPr>
+          <w:rFonts w:ascii="Times New Roman" w:eastAsia="바탕" w:hAnsi="Times New Roman" w:cs="Times New Roman"/>
+          <w:sz w:val="18"/>
+          <w:szCs w:val="18"/>
+          <w:lang w:eastAsia="ko-KR"/>
+        </w:rPr>
+        <w:t>동시접속자</w:t>
+      </w:r>
+      <w:r>
+        <w:rPr>
+          <w:rFonts w:ascii="Times New Roman" w:eastAsia="바탕" w:hAnsi="Times New Roman" w:cs="Times New Roman"/>
+          <w:sz w:val="18"/>
+          <w:szCs w:val="18"/>
+          <w:lang w:eastAsia="ko-KR"/>
+        </w:rPr>
+        <w:t xml:space="preserve"> </w:t>
+      </w:r>
+      <w:r>
+        <w:rPr>
+          <w:rFonts w:ascii="Times New Roman" w:eastAsia="바탕" w:hAnsi="Times New Roman" w:cs="Times New Roman"/>
+          <w:sz w:val="18"/>
+          <w:szCs w:val="18"/>
+          <w:lang w:eastAsia="ko-KR"/>
+        </w:rPr>
+        <w:t>기록을</w:t>
+      </w:r>
+      <w:r>
+        <w:rPr>
+          <w:rFonts w:ascii="Times New Roman" w:eastAsia="바탕" w:hAnsi="Times New Roman" w:cs="Times New Roman"/>
+          <w:sz w:val="18"/>
+          <w:szCs w:val="18"/>
+          <w:lang w:eastAsia="ko-KR"/>
+        </w:rPr>
+        <w:t xml:space="preserve"> </w:t>
+      </w:r>
+      <w:r>
+        <w:rPr>
+          <w:rFonts w:ascii="Times New Roman" w:eastAsia="바탕" w:hAnsi="Times New Roman" w:cs="Times New Roman"/>
+          <w:sz w:val="18"/>
+          <w:szCs w:val="18"/>
+          <w:lang w:eastAsia="ko-KR"/>
+        </w:rPr>
+        <w:t>갱신</w:t>
       </w:r>
       <w:r>
         <w:rPr>
@@ -1958,6 +1893,258 @@
       </w:pPr>
       <w:r>
         <w:rPr>
+          <w:rFonts w:ascii="Times New Roman" w:eastAsia="바탕" w:hAnsi="Times New Roman" w:cs="Times New Roman" w:hint="eastAsia"/>
+          <w:sz w:val="18"/>
+          <w:szCs w:val="18"/>
+          <w:lang w:eastAsia="ko-KR"/>
+        </w:rPr>
+        <w:t>북미</w:t>
+      </w:r>
+      <w:r>
+        <w:rPr>
+          <w:rFonts w:ascii="Times New Roman" w:eastAsia="바탕" w:hAnsi="Times New Roman" w:cs="Times New Roman" w:hint="eastAsia"/>
+          <w:sz w:val="18"/>
+          <w:szCs w:val="18"/>
+          <w:lang w:eastAsia="ko-KR"/>
+        </w:rPr>
+        <w:t xml:space="preserve"> </w:t>
+      </w:r>
+      <w:r>
+        <w:rPr>
+          <w:rFonts w:ascii="Times New Roman" w:eastAsia="바탕" w:hAnsi="Times New Roman" w:cs="Times New Roman" w:hint="eastAsia"/>
+          <w:sz w:val="18"/>
+          <w:szCs w:val="18"/>
+          <w:lang w:eastAsia="ko-KR"/>
+        </w:rPr>
+        <w:t>및</w:t>
+      </w:r>
+      <w:r>
+        <w:rPr>
+          <w:rFonts w:ascii="Times New Roman" w:eastAsia="바탕" w:hAnsi="Times New Roman" w:cs="Times New Roman" w:hint="eastAsia"/>
+          <w:sz w:val="18"/>
+          <w:szCs w:val="18"/>
+          <w:lang w:eastAsia="ko-KR"/>
+        </w:rPr>
+        <w:t xml:space="preserve"> </w:t>
+      </w:r>
+      <w:r>
+        <w:rPr>
+          <w:rFonts w:ascii="Times New Roman" w:eastAsia="바탕" w:hAnsi="Times New Roman" w:cs="Times New Roman" w:hint="eastAsia"/>
+          <w:sz w:val="18"/>
+          <w:szCs w:val="18"/>
+          <w:lang w:eastAsia="ko-KR"/>
+        </w:rPr>
+        <w:t>일본</w:t>
+      </w:r>
+      <w:r>
+        <w:rPr>
+          <w:rFonts w:ascii="Times New Roman" w:eastAsia="바탕" w:hAnsi="Times New Roman" w:cs="Times New Roman" w:hint="eastAsia"/>
+          <w:sz w:val="18"/>
+          <w:szCs w:val="18"/>
+          <w:lang w:eastAsia="ko-KR"/>
+        </w:rPr>
+        <w:t xml:space="preserve"> </w:t>
+      </w:r>
+      <w:r>
+        <w:rPr>
+          <w:rFonts w:ascii="Times New Roman" w:eastAsia="바탕" w:hAnsi="Times New Roman" w:cs="Times New Roman" w:hint="eastAsia"/>
+          <w:sz w:val="18"/>
+          <w:szCs w:val="18"/>
+          <w:lang w:eastAsia="ko-KR"/>
+        </w:rPr>
+        <w:t>공식</w:t>
+      </w:r>
+      <w:r>
+        <w:rPr>
+          <w:rFonts w:ascii="Times New Roman" w:eastAsia="바탕" w:hAnsi="Times New Roman" w:cs="Times New Roman" w:hint="eastAsia"/>
+          <w:sz w:val="18"/>
+          <w:szCs w:val="18"/>
+          <w:lang w:eastAsia="ko-KR"/>
+        </w:rPr>
+        <w:t xml:space="preserve"> </w:t>
+      </w:r>
+      <w:r>
+        <w:rPr>
+          <w:rFonts w:ascii="Times New Roman" w:eastAsia="바탕" w:hAnsi="Times New Roman" w:cs="Times New Roman"/>
+          <w:sz w:val="18"/>
+          <w:szCs w:val="18"/>
+          <w:lang w:eastAsia="ko-KR"/>
+        </w:rPr>
+        <w:t>SNS</w:t>
+      </w:r>
+      <w:r>
+        <w:rPr>
+          <w:rFonts w:ascii="Times New Roman" w:eastAsia="바탕" w:hAnsi="Times New Roman" w:cs="Times New Roman"/>
+          <w:sz w:val="18"/>
+          <w:szCs w:val="18"/>
+          <w:lang w:eastAsia="ko-KR"/>
+        </w:rPr>
+        <w:t>의</w:t>
+      </w:r>
+      <w:r>
+        <w:rPr>
+          <w:rFonts w:ascii="Times New Roman" w:eastAsia="바탕" w:hAnsi="Times New Roman" w:cs="Times New Roman" w:hint="eastAsia"/>
+          <w:sz w:val="18"/>
+          <w:szCs w:val="18"/>
+          <w:lang w:eastAsia="ko-KR"/>
+        </w:rPr>
+        <w:t xml:space="preserve"> </w:t>
+      </w:r>
+      <w:r>
+        <w:rPr>
+          <w:rFonts w:ascii="Times New Roman" w:eastAsia="바탕" w:hAnsi="Times New Roman" w:cs="Times New Roman" w:hint="eastAsia"/>
+          <w:sz w:val="18"/>
+          <w:szCs w:val="18"/>
+          <w:lang w:eastAsia="ko-KR"/>
+        </w:rPr>
+        <w:t>콘텐츠</w:t>
+      </w:r>
+      <w:r>
+        <w:rPr>
+          <w:rFonts w:ascii="Times New Roman" w:eastAsia="바탕" w:hAnsi="Times New Roman" w:cs="Times New Roman" w:hint="eastAsia"/>
+          <w:sz w:val="18"/>
+          <w:szCs w:val="18"/>
+          <w:lang w:eastAsia="ko-KR"/>
+        </w:rPr>
+        <w:t xml:space="preserve"> </w:t>
+      </w:r>
+      <w:r>
+        <w:rPr>
+          <w:rFonts w:ascii="Times New Roman" w:eastAsia="바탕" w:hAnsi="Times New Roman" w:cs="Times New Roman" w:hint="eastAsia"/>
+          <w:sz w:val="18"/>
+          <w:szCs w:val="18"/>
+          <w:lang w:eastAsia="ko-KR"/>
+        </w:rPr>
+        <w:t>기획</w:t>
+      </w:r>
+      <w:r>
+        <w:rPr>
+          <w:rFonts w:ascii="Times New Roman" w:eastAsia="바탕" w:hAnsi="Times New Roman" w:cs="Times New Roman" w:hint="eastAsia"/>
+          <w:sz w:val="18"/>
+          <w:szCs w:val="18"/>
+          <w:lang w:eastAsia="ko-KR"/>
+        </w:rPr>
+        <w:t>,</w:t>
+      </w:r>
+      <w:r>
+        <w:rPr>
+          <w:rFonts w:ascii="Times New Roman" w:eastAsia="바탕" w:hAnsi="Times New Roman" w:cs="Times New Roman"/>
+          <w:sz w:val="18"/>
+          <w:szCs w:val="18"/>
+          <w:lang w:eastAsia="ko-KR"/>
+        </w:rPr>
+        <w:t xml:space="preserve"> </w:t>
+      </w:r>
+      <w:r>
+        <w:rPr>
+          <w:rFonts w:ascii="Times New Roman" w:eastAsia="바탕" w:hAnsi="Times New Roman" w:cs="Times New Roman"/>
+          <w:sz w:val="18"/>
+          <w:szCs w:val="18"/>
+          <w:lang w:eastAsia="ko-KR"/>
+        </w:rPr>
+        <w:t>현지화</w:t>
+      </w:r>
+      <w:r>
+        <w:rPr>
+          <w:rFonts w:ascii="Times New Roman" w:eastAsia="바탕" w:hAnsi="Times New Roman" w:cs="Times New Roman" w:hint="eastAsia"/>
+          <w:sz w:val="18"/>
+          <w:szCs w:val="18"/>
+          <w:lang w:eastAsia="ko-KR"/>
+        </w:rPr>
+        <w:t>,</w:t>
+      </w:r>
+      <w:r>
+        <w:rPr>
+          <w:rFonts w:ascii="Times New Roman" w:eastAsia="바탕" w:hAnsi="Times New Roman" w:cs="Times New Roman"/>
+          <w:sz w:val="18"/>
+          <w:szCs w:val="18"/>
+          <w:lang w:eastAsia="ko-KR"/>
+        </w:rPr>
+        <w:t xml:space="preserve"> </w:t>
+      </w:r>
+      <w:r>
+        <w:rPr>
+          <w:rFonts w:ascii="Times New Roman" w:eastAsia="바탕" w:hAnsi="Times New Roman" w:cs="Times New Roman"/>
+          <w:sz w:val="18"/>
+          <w:szCs w:val="18"/>
+          <w:lang w:eastAsia="ko-KR"/>
+        </w:rPr>
+        <w:t>카피라이팅과</w:t>
+      </w:r>
+      <w:r>
+        <w:rPr>
+          <w:rFonts w:ascii="Times New Roman" w:eastAsia="바탕" w:hAnsi="Times New Roman" w:cs="Times New Roman" w:hint="eastAsia"/>
+          <w:sz w:val="18"/>
+          <w:szCs w:val="18"/>
+          <w:lang w:eastAsia="ko-KR"/>
+        </w:rPr>
+        <w:t xml:space="preserve"> </w:t>
+      </w:r>
+      <w:r>
+        <w:rPr>
+          <w:rFonts w:ascii="Times New Roman" w:eastAsia="바탕" w:hAnsi="Times New Roman" w:cs="Times New Roman" w:hint="eastAsia"/>
+          <w:sz w:val="18"/>
+          <w:szCs w:val="18"/>
+          <w:lang w:eastAsia="ko-KR"/>
+        </w:rPr>
+        <w:t>커뮤니티</w:t>
+      </w:r>
+      <w:r>
+        <w:rPr>
+          <w:rFonts w:ascii="Times New Roman" w:eastAsia="바탕" w:hAnsi="Times New Roman" w:cs="Times New Roman" w:hint="eastAsia"/>
+          <w:sz w:val="18"/>
+          <w:szCs w:val="18"/>
+          <w:lang w:eastAsia="ko-KR"/>
+        </w:rPr>
+        <w:t xml:space="preserve"> </w:t>
+      </w:r>
+      <w:r>
+        <w:rPr>
+          <w:rFonts w:ascii="Times New Roman" w:eastAsia="바탕" w:hAnsi="Times New Roman" w:cs="Times New Roman" w:hint="eastAsia"/>
+          <w:sz w:val="18"/>
+          <w:szCs w:val="18"/>
+          <w:lang w:eastAsia="ko-KR"/>
+        </w:rPr>
+        <w:t>운영</w:t>
+      </w:r>
+      <w:r>
+        <w:rPr>
+          <w:rFonts w:ascii="Times New Roman" w:eastAsia="바탕" w:hAnsi="Times New Roman" w:cs="Times New Roman" w:hint="eastAsia"/>
+          <w:sz w:val="18"/>
+          <w:szCs w:val="18"/>
+          <w:lang w:eastAsia="ko-KR"/>
+        </w:rPr>
+        <w:t xml:space="preserve"> </w:t>
+      </w:r>
+      <w:r>
+        <w:rPr>
+          <w:rFonts w:ascii="Times New Roman" w:eastAsia="바탕" w:hAnsi="Times New Roman" w:cs="Times New Roman" w:hint="eastAsia"/>
+          <w:sz w:val="18"/>
+          <w:szCs w:val="18"/>
+          <w:lang w:eastAsia="ko-KR"/>
+        </w:rPr>
+        <w:t>전담</w:t>
+      </w:r>
+      <w:r>
+        <w:rPr>
+          <w:rFonts w:ascii="Times New Roman" w:eastAsia="바탕" w:hAnsi="Times New Roman" w:cs="Times New Roman" w:hint="eastAsia"/>
+          <w:sz w:val="18"/>
+          <w:szCs w:val="18"/>
+          <w:lang w:eastAsia="ko-KR"/>
+        </w:rPr>
+        <w:t>.</w:t>
+      </w:r>
+      <w:r>
+        <w:rPr>
+          <w:rFonts w:ascii="Times New Roman" w:eastAsia="바탕" w:hAnsi="Times New Roman" w:cs="Times New Roman"/>
+          <w:sz w:val="18"/>
+          <w:szCs w:val="18"/>
+          <w:lang w:eastAsia="ko-KR"/>
+        </w:rPr>
+        <w:t xml:space="preserve"> </w:t>
+      </w:r>
+      <w:r>
+        <w:rPr>
           <w:rFonts w:ascii="Times New Roman" w:eastAsia="바탕" w:hAnsi="Times New Roman" w:cs="Times New Roman"/>
           <w:sz w:val="18"/>
           <w:szCs w:val="18"/>
@@ -1967,12 +2154,21 @@
       </w:r>
       <w:r>
         <w:rPr>
-          <w:rFonts w:ascii="Times New Roman" w:eastAsia="바탕" w:hAnsi="Times New Roman" w:cs="Times New Roman"/>
-          <w:sz w:val="18"/>
-          <w:szCs w:val="18"/>
-          <w:lang w:eastAsia="ko-KR"/>
-        </w:rPr>
-        <w:t xml:space="preserve"> 0</w:t>
+          <w:rFonts w:ascii="Times New Roman" w:eastAsia="바탕" w:hAnsi="Times New Roman" w:cs="Times New Roman" w:hint="eastAsia"/>
+          <w:sz w:val="18"/>
+          <w:szCs w:val="18"/>
+          <w:lang w:eastAsia="ko-KR"/>
+        </w:rPr>
+        <w:t xml:space="preserve"> </w:t>
+      </w:r>
+      <w:r>
+        <w:rPr>
+          <w:rFonts w:ascii="Times New Roman" w:eastAsia="바탕" w:hAnsi="Times New Roman" w:cs="Times New Roman"/>
+          <w:sz w:val="18"/>
+          <w:szCs w:val="18"/>
+          <w:lang w:eastAsia="ko-KR"/>
+        </w:rPr>
+        <w:t>0</w:t>
       </w:r>
       <w:r>
         <w:rPr>
@@ -1985,214 +2181,61 @@
       </w:r>
       <w:r>
         <w:rPr>
-          <w:rFonts w:ascii="Times New Roman" w:eastAsia="바탕" w:hAnsi="Times New Roman" w:cs="Times New Roman"/>
-          <w:sz w:val="18"/>
-          <w:szCs w:val="18"/>
-          <w:lang w:eastAsia="ko-KR"/>
-        </w:rPr>
-        <w:t xml:space="preserve"> </w:t>
-      </w:r>
-      <w:r>
-        <w:rPr>
-          <w:rFonts w:ascii="Times New Roman" w:eastAsia="바탕" w:hAnsi="Times New Roman" w:cs="Times New Roman"/>
-          <w:sz w:val="18"/>
-          <w:szCs w:val="18"/>
-          <w:lang w:eastAsia="ko-KR"/>
-        </w:rPr>
-        <w:t>시작한</w:t>
-      </w:r>
-      <w:r>
-        <w:rPr>
-          <w:rFonts w:ascii="Times New Roman" w:eastAsia="바탕" w:hAnsi="Times New Roman" w:cs="Times New Roman"/>
-          <w:sz w:val="18"/>
-          <w:szCs w:val="18"/>
-          <w:lang w:eastAsia="ko-KR"/>
-        </w:rPr>
-        <w:t xml:space="preserve"> </w:t>
-      </w:r>
-      <w:r>
-        <w:rPr>
-          <w:rFonts w:ascii="Times New Roman" w:eastAsia="바탕" w:hAnsi="Times New Roman" w:cs="Times New Roman"/>
-          <w:sz w:val="18"/>
-          <w:szCs w:val="18"/>
-          <w:lang w:eastAsia="ko-KR"/>
-        </w:rPr>
-        <w:t>북미</w:t>
-      </w:r>
-      <w:r>
-        <w:rPr>
-          <w:rFonts w:ascii="Times New Roman" w:eastAsia="바탕" w:hAnsi="Times New Roman" w:cs="Times New Roman"/>
-          <w:sz w:val="18"/>
-          <w:szCs w:val="18"/>
-          <w:lang w:eastAsia="ko-KR"/>
-        </w:rPr>
-        <w:t xml:space="preserve"> </w:t>
-      </w:r>
-      <w:r>
-        <w:rPr>
-          <w:rFonts w:ascii="Times New Roman" w:eastAsia="바탕" w:hAnsi="Times New Roman" w:cs="Times New Roman"/>
-          <w:sz w:val="18"/>
-          <w:szCs w:val="18"/>
-          <w:lang w:eastAsia="ko-KR"/>
-        </w:rPr>
-        <w:t>및</w:t>
-      </w:r>
-      <w:r>
-        <w:rPr>
-          <w:rFonts w:ascii="Times New Roman" w:eastAsia="바탕" w:hAnsi="Times New Roman" w:cs="Times New Roman"/>
-          <w:sz w:val="18"/>
-          <w:szCs w:val="18"/>
-          <w:lang w:eastAsia="ko-KR"/>
-        </w:rPr>
-        <w:t xml:space="preserve"> </w:t>
-      </w:r>
-      <w:r>
-        <w:rPr>
-          <w:rFonts w:ascii="Times New Roman" w:eastAsia="바탕" w:hAnsi="Times New Roman" w:cs="Times New Roman"/>
-          <w:sz w:val="18"/>
-          <w:szCs w:val="18"/>
-          <w:lang w:eastAsia="ko-KR"/>
-        </w:rPr>
-        <w:t>일본</w:t>
-      </w:r>
-      <w:r>
-        <w:rPr>
-          <w:rFonts w:ascii="Times New Roman" w:eastAsia="바탕" w:hAnsi="Times New Roman" w:cs="Times New Roman"/>
-          <w:sz w:val="18"/>
-          <w:szCs w:val="18"/>
-          <w:lang w:eastAsia="ko-KR"/>
-        </w:rPr>
-        <w:t xml:space="preserve"> SNS </w:t>
-      </w:r>
-      <w:r>
-        <w:rPr>
-          <w:rFonts w:ascii="Times New Roman" w:eastAsia="바탕" w:hAnsi="Times New Roman" w:cs="Times New Roman"/>
-          <w:sz w:val="18"/>
-          <w:szCs w:val="18"/>
-          <w:lang w:eastAsia="ko-KR"/>
-        </w:rPr>
-        <w:t>계정의</w:t>
-      </w:r>
-      <w:r>
-        <w:rPr>
-          <w:rFonts w:ascii="Times New Roman" w:eastAsia="바탕" w:hAnsi="Times New Roman" w:cs="Times New Roman"/>
-          <w:sz w:val="18"/>
-          <w:szCs w:val="18"/>
-          <w:lang w:eastAsia="ko-KR"/>
-        </w:rPr>
-        <w:t xml:space="preserve"> </w:t>
-      </w:r>
-      <w:r>
-        <w:rPr>
-          <w:rFonts w:ascii="Times New Roman" w:eastAsia="바탕" w:hAnsi="Times New Roman" w:cs="Times New Roman"/>
-          <w:sz w:val="18"/>
-          <w:szCs w:val="18"/>
-          <w:lang w:eastAsia="ko-KR"/>
-        </w:rPr>
-        <w:t>콘텐츠</w:t>
-      </w:r>
-      <w:r>
-        <w:rPr>
-          <w:rFonts w:ascii="Times New Roman" w:eastAsia="바탕" w:hAnsi="Times New Roman" w:cs="Times New Roman"/>
-          <w:sz w:val="18"/>
-          <w:szCs w:val="18"/>
-          <w:lang w:eastAsia="ko-KR"/>
-        </w:rPr>
-        <w:t xml:space="preserve"> </w:t>
-      </w:r>
-      <w:r>
-        <w:rPr>
-          <w:rFonts w:ascii="Times New Roman" w:eastAsia="바탕" w:hAnsi="Times New Roman" w:cs="Times New Roman"/>
-          <w:sz w:val="18"/>
-          <w:szCs w:val="18"/>
-          <w:lang w:eastAsia="ko-KR"/>
-        </w:rPr>
-        <w:t>기획</w:t>
-      </w:r>
-      <w:r>
-        <w:rPr>
-          <w:rFonts w:ascii="Times New Roman" w:eastAsia="바탕" w:hAnsi="Times New Roman" w:cs="Times New Roman"/>
-          <w:sz w:val="18"/>
-          <w:szCs w:val="18"/>
-          <w:lang w:eastAsia="ko-KR"/>
-        </w:rPr>
-        <w:t xml:space="preserve">, </w:t>
-      </w:r>
-      <w:r>
-        <w:rPr>
-          <w:rFonts w:ascii="Times New Roman" w:eastAsia="바탕" w:hAnsi="Times New Roman" w:cs="Times New Roman"/>
-          <w:sz w:val="18"/>
-          <w:szCs w:val="18"/>
-          <w:lang w:eastAsia="ko-KR"/>
-        </w:rPr>
-        <w:t>카피라이팅</w:t>
-      </w:r>
-      <w:r>
-        <w:rPr>
-          <w:rFonts w:ascii="Times New Roman" w:eastAsia="바탕" w:hAnsi="Times New Roman" w:cs="Times New Roman"/>
-          <w:sz w:val="18"/>
-          <w:szCs w:val="18"/>
-          <w:lang w:eastAsia="ko-KR"/>
-        </w:rPr>
-        <w:t xml:space="preserve"> </w:t>
-      </w:r>
-      <w:r>
-        <w:rPr>
-          <w:rFonts w:ascii="Times New Roman" w:eastAsia="바탕" w:hAnsi="Times New Roman" w:cs="Times New Roman"/>
-          <w:sz w:val="18"/>
-          <w:szCs w:val="18"/>
-          <w:lang w:eastAsia="ko-KR"/>
-        </w:rPr>
-        <w:t>및</w:t>
-      </w:r>
-      <w:r>
-        <w:rPr>
-          <w:rFonts w:ascii="Times New Roman" w:eastAsia="바탕" w:hAnsi="Times New Roman" w:cs="Times New Roman"/>
-          <w:sz w:val="18"/>
-          <w:szCs w:val="18"/>
-          <w:lang w:eastAsia="ko-KR"/>
-        </w:rPr>
-        <w:t xml:space="preserve"> </w:t>
-      </w:r>
-      <w:r>
-        <w:rPr>
-          <w:rFonts w:ascii="Times New Roman" w:eastAsia="바탕" w:hAnsi="Times New Roman" w:cs="Times New Roman"/>
-          <w:sz w:val="18"/>
-          <w:szCs w:val="18"/>
-          <w:lang w:eastAsia="ko-KR"/>
-        </w:rPr>
-        <w:t>운영을</w:t>
-      </w:r>
-      <w:r>
-        <w:rPr>
-          <w:rFonts w:ascii="Times New Roman" w:eastAsia="바탕" w:hAnsi="Times New Roman" w:cs="Times New Roman"/>
-          <w:sz w:val="18"/>
-          <w:szCs w:val="18"/>
-          <w:lang w:eastAsia="ko-KR"/>
-        </w:rPr>
-        <w:t xml:space="preserve"> </w:t>
-      </w:r>
-      <w:r>
-        <w:rPr>
-          <w:rFonts w:ascii="Times New Roman" w:eastAsia="바탕" w:hAnsi="Times New Roman" w:cs="Times New Roman"/>
-          <w:sz w:val="18"/>
-          <w:szCs w:val="18"/>
-          <w:lang w:eastAsia="ko-KR"/>
-        </w:rPr>
-        <w:t>전담</w:t>
-      </w:r>
-      <w:r>
-        <w:rPr>
-          <w:rFonts w:ascii="Times New Roman" w:eastAsia="바탕" w:hAnsi="Times New Roman" w:cs="Times New Roman"/>
-          <w:sz w:val="18"/>
-          <w:szCs w:val="18"/>
-          <w:lang w:eastAsia="ko-KR"/>
-        </w:rPr>
-        <w:t xml:space="preserve">. </w:t>
-      </w:r>
-      <w:r>
-        <w:rPr>
-          <w:rFonts w:ascii="Times New Roman" w:eastAsia="바탕" w:hAnsi="Times New Roman" w:cs="Times New Roman"/>
+          <w:rFonts w:ascii="Times New Roman" w:eastAsia="바탕" w:hAnsi="Times New Roman" w:cs="Times New Roman" w:hint="eastAsia"/>
+          <w:sz w:val="18"/>
+          <w:szCs w:val="18"/>
+          <w:lang w:eastAsia="ko-KR"/>
+        </w:rPr>
+        <w:t xml:space="preserve"> </w:t>
+      </w:r>
+      <w:r>
+        <w:rPr>
+          <w:rFonts w:ascii="Times New Roman" w:eastAsia="바탕" w:hAnsi="Times New Roman" w:cs="Times New Roman" w:hint="eastAsia"/>
+          <w:sz w:val="18"/>
+          <w:szCs w:val="18"/>
+          <w:lang w:eastAsia="ko-KR"/>
+        </w:rPr>
+        <w:t>시작해</w:t>
+      </w:r>
+      <w:r>
+        <w:rPr>
+          <w:rFonts w:ascii="Times New Roman" w:eastAsia="바탕" w:hAnsi="Times New Roman" w:cs="Times New Roman" w:hint="eastAsia"/>
+          <w:sz w:val="18"/>
+          <w:szCs w:val="18"/>
+          <w:lang w:eastAsia="ko-KR"/>
+        </w:rPr>
+        <w:t xml:space="preserve"> </w:t>
+      </w:r>
+      <w:r>
+        <w:rPr>
+          <w:rFonts w:ascii="Times New Roman" w:eastAsia="바탕" w:hAnsi="Times New Roman" w:cs="Times New Roman"/>
+          <w:sz w:val="18"/>
+          <w:szCs w:val="18"/>
+          <w:lang w:eastAsia="ko-KR"/>
+        </w:rPr>
+        <w:t>4</w:t>
+      </w:r>
+      <w:r>
+        <w:rPr>
+          <w:rFonts w:ascii="Times New Roman" w:eastAsia="바탕" w:hAnsi="Times New Roman" w:cs="Times New Roman"/>
+          <w:sz w:val="18"/>
+          <w:szCs w:val="18"/>
+          <w:lang w:eastAsia="ko-KR"/>
+        </w:rPr>
+        <w:t>개월간</w:t>
+      </w:r>
+      <w:r>
+        <w:rPr>
+          <w:rFonts w:ascii="Times New Roman" w:eastAsia="바탕" w:hAnsi="Times New Roman" w:cs="Times New Roman" w:hint="eastAsia"/>
+          <w:sz w:val="18"/>
+          <w:szCs w:val="18"/>
+          <w:lang w:eastAsia="ko-KR"/>
+        </w:rPr>
+        <w:t xml:space="preserve"> </w:t>
+      </w:r>
+      <w:r>
+        <w:rPr>
+          <w:rFonts w:ascii="Times New Roman" w:eastAsia="바탕" w:hAnsi="Times New Roman" w:cs="Times New Roman" w:hint="eastAsia"/>
           <w:sz w:val="18"/>
           <w:szCs w:val="18"/>
           <w:lang w:eastAsia="ko-KR"/>
@@ -2201,16 +2244,16 @@
       </w:r>
       <w:r>
         <w:rPr>
-          <w:rFonts w:ascii="Times New Roman" w:eastAsia="바탕" w:hAnsi="Times New Roman" w:cs="Times New Roman"/>
-          <w:sz w:val="18"/>
-          <w:szCs w:val="18"/>
-          <w:lang w:eastAsia="ko-KR"/>
-        </w:rPr>
-        <w:t xml:space="preserve"> </w:t>
-      </w:r>
-      <w:r>
-        <w:rPr>
-          <w:rFonts w:ascii="Times New Roman" w:eastAsia="바탕" w:hAnsi="Times New Roman" w:cs="Times New Roman"/>
+          <w:rFonts w:ascii="Times New Roman" w:eastAsia="바탕" w:hAnsi="Times New Roman" w:cs="Times New Roman" w:hint="eastAsia"/>
+          <w:sz w:val="18"/>
+          <w:szCs w:val="18"/>
+          <w:lang w:eastAsia="ko-KR"/>
+        </w:rPr>
+        <w:t xml:space="preserve"> </w:t>
+      </w:r>
+      <w:r>
+        <w:rPr>
+          <w:rFonts w:ascii="Times New Roman" w:eastAsia="바탕" w:hAnsi="Times New Roman" w:cs="Times New Roman" w:hint="eastAsia"/>
           <w:sz w:val="18"/>
           <w:szCs w:val="18"/>
           <w:lang w:eastAsia="ko-KR"/>
@@ -2219,52 +2262,16 @@
       </w:r>
       <w:r>
         <w:rPr>
-          <w:rFonts w:ascii="Times New Roman" w:eastAsia="바탕" w:hAnsi="Times New Roman" w:cs="Times New Roman"/>
-          <w:sz w:val="18"/>
-          <w:szCs w:val="18"/>
-          <w:lang w:eastAsia="ko-KR"/>
-        </w:rPr>
-        <w:t xml:space="preserve"> </w:t>
-      </w:r>
-      <w:r>
-        <w:rPr>
-          <w:rFonts w:ascii="Times New Roman" w:eastAsia="바탕" w:hAnsi="Times New Roman" w:cs="Times New Roman"/>
-          <w:sz w:val="18"/>
-          <w:szCs w:val="18"/>
-          <w:lang w:eastAsia="ko-KR"/>
-        </w:rPr>
-        <w:t>약</w:t>
-      </w:r>
-      <w:r>
-        <w:rPr>
-          <w:rFonts w:ascii="Times New Roman" w:eastAsia="바탕" w:hAnsi="Times New Roman" w:cs="Times New Roman"/>
-          <w:sz w:val="18"/>
-          <w:szCs w:val="18"/>
-          <w:lang w:eastAsia="ko-KR"/>
-        </w:rPr>
-        <w:t xml:space="preserve"> 4</w:t>
-      </w:r>
-      <w:r>
-        <w:rPr>
-          <w:rFonts w:ascii="Times New Roman" w:eastAsia="바탕" w:hAnsi="Times New Roman" w:cs="Times New Roman"/>
-          <w:sz w:val="18"/>
-          <w:szCs w:val="18"/>
-          <w:lang w:eastAsia="ko-KR"/>
-        </w:rPr>
-        <w:t>개월간</w:t>
-      </w:r>
-      <w:r>
-        <w:rPr>
-          <w:rFonts w:ascii="Times New Roman" w:eastAsia="바탕" w:hAnsi="Times New Roman" w:cs="Times New Roman"/>
-          <w:sz w:val="18"/>
-          <w:szCs w:val="18"/>
-          <w:lang w:eastAsia="ko-KR"/>
-        </w:rPr>
-        <w:t xml:space="preserve"> </w:t>
-      </w:r>
-      <w:r>
-        <w:rPr>
-          <w:rFonts w:ascii="Times New Roman" w:eastAsia="바탕" w:hAnsi="Times New Roman" w:cs="Times New Roman"/>
+          <w:rFonts w:ascii="Times New Roman" w:eastAsia="바탕" w:hAnsi="Times New Roman" w:cs="Times New Roman" w:hint="eastAsia"/>
+          <w:sz w:val="18"/>
+          <w:szCs w:val="18"/>
+          <w:lang w:eastAsia="ko-KR"/>
+        </w:rPr>
+        <w:t xml:space="preserve"> </w:t>
+      </w:r>
+      <w:r>
+        <w:rPr>
+          <w:rFonts w:ascii="Times New Roman" w:eastAsia="바탕" w:hAnsi="Times New Roman" w:cs="Times New Roman" w:hint="eastAsia"/>
           <w:sz w:val="18"/>
           <w:szCs w:val="18"/>
           <w:lang w:eastAsia="ko-KR"/>
@@ -2273,16 +2280,16 @@
       </w:r>
       <w:r>
         <w:rPr>
-          <w:rFonts w:ascii="Times New Roman" w:eastAsia="바탕" w:hAnsi="Times New Roman" w:cs="Times New Roman"/>
-          <w:sz w:val="18"/>
-          <w:szCs w:val="18"/>
-          <w:lang w:eastAsia="ko-KR"/>
-        </w:rPr>
-        <w:t xml:space="preserve"> </w:t>
-      </w:r>
-      <w:r>
-        <w:rPr>
-          <w:rFonts w:ascii="Times New Roman" w:eastAsia="바탕" w:hAnsi="Times New Roman" w:cs="Times New Roman"/>
+          <w:rFonts w:ascii="Times New Roman" w:eastAsia="바탕" w:hAnsi="Times New Roman" w:cs="Times New Roman" w:hint="eastAsia"/>
+          <w:sz w:val="18"/>
+          <w:szCs w:val="18"/>
+          <w:lang w:eastAsia="ko-KR"/>
+        </w:rPr>
+        <w:t xml:space="preserve"> </w:t>
+      </w:r>
+      <w:r>
+        <w:rPr>
+          <w:rFonts w:ascii="Times New Roman" w:eastAsia="바탕" w:hAnsi="Times New Roman" w:cs="Times New Roman" w:hint="eastAsia"/>
           <w:sz w:val="18"/>
           <w:szCs w:val="18"/>
           <w:lang w:eastAsia="ko-KR"/>
@@ -2291,12 +2298,21 @@
       </w:r>
       <w:r>
         <w:rPr>
-          <w:rFonts w:ascii="Times New Roman" w:eastAsia="바탕" w:hAnsi="Times New Roman" w:cs="Times New Roman"/>
-          <w:sz w:val="18"/>
-          <w:szCs w:val="18"/>
-          <w:lang w:eastAsia="ko-KR"/>
-        </w:rPr>
-        <w:t xml:space="preserve"> 213.7</w:t>
+          <w:rFonts w:ascii="Times New Roman" w:eastAsia="바탕" w:hAnsi="Times New Roman" w:cs="Times New Roman" w:hint="eastAsia"/>
+          <w:sz w:val="18"/>
+          <w:szCs w:val="18"/>
+          <w:lang w:eastAsia="ko-KR"/>
+        </w:rPr>
+        <w:t xml:space="preserve"> </w:t>
+      </w:r>
+      <w:r>
+        <w:rPr>
+          <w:rFonts w:ascii="Times New Roman" w:eastAsia="바탕" w:hAnsi="Times New Roman" w:cs="Times New Roman"/>
+          <w:sz w:val="18"/>
+          <w:szCs w:val="18"/>
+          <w:lang w:eastAsia="ko-KR"/>
+        </w:rPr>
+        <w:t>454</w:t>
       </w:r>
       <w:r>
         <w:rPr>
@@ -2309,16 +2325,16 @@
       </w:r>
       <w:r>
         <w:rPr>
-          <w:rFonts w:ascii="Times New Roman" w:eastAsia="바탕" w:hAnsi="Times New Roman" w:cs="Times New Roman"/>
-          <w:sz w:val="18"/>
-          <w:szCs w:val="18"/>
-          <w:lang w:eastAsia="ko-KR"/>
-        </w:rPr>
-        <w:t xml:space="preserve"> </w:t>
-      </w:r>
-      <w:r>
-        <w:rPr>
-          <w:rFonts w:ascii="Times New Roman" w:eastAsia="바탕" w:hAnsi="Times New Roman" w:cs="Times New Roman"/>
+          <w:rFonts w:ascii="Times New Roman" w:eastAsia="바탕" w:hAnsi="Times New Roman" w:cs="Times New Roman" w:hint="eastAsia"/>
+          <w:sz w:val="18"/>
+          <w:szCs w:val="18"/>
+          <w:lang w:eastAsia="ko-KR"/>
+        </w:rPr>
+        <w:t xml:space="preserve"> </w:t>
+      </w:r>
+      <w:r>
+        <w:rPr>
+          <w:rFonts w:ascii="Times New Roman" w:eastAsia="바탕" w:hAnsi="Times New Roman" w:cs="Times New Roman" w:hint="eastAsia"/>
           <w:sz w:val="18"/>
           <w:szCs w:val="18"/>
           <w:lang w:eastAsia="ko-KR"/>
@@ -2327,138 +2343,21 @@
       </w:r>
       <w:r>
         <w:rPr>
-          <w:rFonts w:ascii="Times New Roman" w:eastAsia="바탕" w:hAnsi="Times New Roman" w:cs="Times New Roman"/>
-          <w:sz w:val="18"/>
-          <w:szCs w:val="18"/>
-          <w:lang w:eastAsia="ko-KR"/>
-        </w:rPr>
-        <w:t xml:space="preserve"> </w:t>
-      </w:r>
-      <w:r>
-        <w:rPr>
-          <w:rFonts w:ascii="Times New Roman" w:eastAsia="바탕" w:hAnsi="Times New Roman" w:cs="Times New Roman"/>
-          <w:sz w:val="18"/>
-          <w:szCs w:val="18"/>
-          <w:lang w:eastAsia="ko-KR"/>
-        </w:rPr>
-        <w:t>달성</w:t>
-      </w:r>
-      <w:r>
-        <w:rPr>
-          <w:rFonts w:ascii="Times New Roman" w:eastAsia="바탕" w:hAnsi="Times New Roman" w:cs="Times New Roman"/>
-          <w:sz w:val="18"/>
-          <w:szCs w:val="18"/>
-          <w:lang w:eastAsia="ko-KR"/>
-        </w:rPr>
-        <w:t xml:space="preserve">, </w:t>
-      </w:r>
-      <w:r>
-        <w:rPr>
-          <w:rFonts w:ascii="Times New Roman" w:eastAsia="바탕" w:hAnsi="Times New Roman" w:cs="Times New Roman"/>
-          <w:sz w:val="18"/>
-          <w:szCs w:val="18"/>
-          <w:lang w:eastAsia="ko-KR"/>
-        </w:rPr>
-        <w:t>전월</w:t>
-      </w:r>
-      <w:r>
-        <w:rPr>
-          <w:rFonts w:ascii="Times New Roman" w:eastAsia="바탕" w:hAnsi="Times New Roman" w:cs="Times New Roman"/>
-          <w:sz w:val="18"/>
-          <w:szCs w:val="18"/>
-          <w:lang w:eastAsia="ko-KR"/>
-        </w:rPr>
-        <w:t xml:space="preserve"> </w:t>
-      </w:r>
-      <w:r>
-        <w:rPr>
-          <w:rFonts w:ascii="Times New Roman" w:eastAsia="바탕" w:hAnsi="Times New Roman" w:cs="Times New Roman"/>
-          <w:sz w:val="18"/>
-          <w:szCs w:val="18"/>
-          <w:lang w:eastAsia="ko-KR"/>
-        </w:rPr>
-        <w:t>동기간</w:t>
-      </w:r>
-      <w:r>
-        <w:rPr>
-          <w:rFonts w:ascii="Times New Roman" w:eastAsia="바탕" w:hAnsi="Times New Roman" w:cs="Times New Roman"/>
-          <w:sz w:val="18"/>
-          <w:szCs w:val="18"/>
-          <w:lang w:eastAsia="ko-KR"/>
-        </w:rPr>
-        <w:t xml:space="preserve"> </w:t>
-      </w:r>
-      <w:r>
-        <w:rPr>
-          <w:rFonts w:ascii="Times New Roman" w:eastAsia="바탕" w:hAnsi="Times New Roman" w:cs="Times New Roman"/>
-          <w:sz w:val="18"/>
-          <w:szCs w:val="18"/>
-          <w:lang w:eastAsia="ko-KR"/>
-        </w:rPr>
-        <w:t>대비</w:t>
-      </w:r>
-      <w:r>
-        <w:rPr>
-          <w:rFonts w:ascii="Times New Roman" w:eastAsia="바탕" w:hAnsi="Times New Roman" w:cs="Times New Roman"/>
-          <w:sz w:val="18"/>
-          <w:szCs w:val="18"/>
-          <w:lang w:eastAsia="ko-KR"/>
-        </w:rPr>
-        <w:t xml:space="preserve"> </w:t>
-      </w:r>
-      <w:r>
-        <w:rPr>
-          <w:rFonts w:ascii="Times New Roman" w:eastAsia="바탕" w:hAnsi="Times New Roman" w:cs="Times New Roman"/>
-          <w:sz w:val="18"/>
-          <w:szCs w:val="18"/>
-          <w:lang w:eastAsia="ko-KR"/>
-        </w:rPr>
-        <w:t>노출</w:t>
-      </w:r>
-      <w:r>
-        <w:rPr>
-          <w:rFonts w:ascii="Times New Roman" w:eastAsia="바탕" w:hAnsi="Times New Roman" w:cs="Times New Roman"/>
-          <w:sz w:val="18"/>
-          <w:szCs w:val="18"/>
-          <w:lang w:eastAsia="ko-KR"/>
-        </w:rPr>
-        <w:t xml:space="preserve"> 468%, </w:t>
-      </w:r>
-      <w:r>
-        <w:rPr>
-          <w:rFonts w:ascii="Times New Roman" w:eastAsia="바탕" w:hAnsi="Times New Roman" w:cs="Times New Roman"/>
-          <w:sz w:val="18"/>
-          <w:szCs w:val="18"/>
-          <w:lang w:eastAsia="ko-KR"/>
-        </w:rPr>
-        <w:t>프로필</w:t>
-      </w:r>
-      <w:r>
-        <w:rPr>
-          <w:rFonts w:ascii="Times New Roman" w:eastAsia="바탕" w:hAnsi="Times New Roman" w:cs="Times New Roman"/>
-          <w:sz w:val="18"/>
-          <w:szCs w:val="18"/>
-          <w:lang w:eastAsia="ko-KR"/>
-        </w:rPr>
-        <w:t xml:space="preserve"> </w:t>
-      </w:r>
-      <w:r>
-        <w:rPr>
-          <w:rFonts w:ascii="Times New Roman" w:eastAsia="바탕" w:hAnsi="Times New Roman" w:cs="Times New Roman"/>
-          <w:sz w:val="18"/>
-          <w:szCs w:val="18"/>
-          <w:lang w:eastAsia="ko-KR"/>
-        </w:rPr>
-        <w:t>방문</w:t>
-      </w:r>
-      <w:r>
-        <w:rPr>
-          <w:rFonts w:ascii="Times New Roman" w:eastAsia="바탕" w:hAnsi="Times New Roman" w:cs="Times New Roman"/>
-          <w:sz w:val="18"/>
-          <w:szCs w:val="18"/>
-          <w:lang w:eastAsia="ko-KR"/>
-        </w:rPr>
-        <w:t xml:space="preserve"> 443%, </w:t>
+          <w:rFonts w:ascii="Times New Roman" w:eastAsia="바탕" w:hAnsi="Times New Roman" w:cs="Times New Roman" w:hint="eastAsia"/>
+          <w:sz w:val="18"/>
+          <w:szCs w:val="18"/>
+          <w:lang w:eastAsia="ko-KR"/>
+        </w:rPr>
+        <w:t>,</w:t>
+      </w:r>
+      <w:r>
+        <w:rPr>
+          <w:rFonts w:ascii="Times New Roman" w:eastAsia="바탕" w:hAnsi="Times New Roman" w:cs="Times New Roman"/>
+          <w:sz w:val="18"/>
+          <w:szCs w:val="18"/>
+          <w:lang w:eastAsia="ko-KR"/>
+        </w:rPr>
+        <w:t xml:space="preserve"> </w:t>
       </w:r>
       <w:r>
         <w:rPr>
@@ -2471,67 +2370,186 @@
       </w:r>
       <w:r>
         <w:rPr>
-          <w:rFonts w:ascii="Times New Roman" w:eastAsia="바탕" w:hAnsi="Times New Roman" w:cs="Times New Roman"/>
-          <w:sz w:val="18"/>
-          <w:szCs w:val="18"/>
-          <w:lang w:eastAsia="ko-KR"/>
-        </w:rPr>
-        <w:t xml:space="preserve"> </w:t>
-      </w:r>
-      <w:r>
-        <w:rPr>
-          <w:rFonts w:ascii="Times New Roman" w:eastAsia="바탕" w:hAnsi="Times New Roman" w:cs="Times New Roman"/>
-          <w:sz w:val="18"/>
-          <w:szCs w:val="18"/>
-          <w:lang w:eastAsia="ko-KR"/>
-        </w:rPr>
-        <w:t>팔로워</w:t>
-      </w:r>
-      <w:r>
-        <w:rPr>
-          <w:rFonts w:ascii="Times New Roman" w:eastAsia="바탕" w:hAnsi="Times New Roman" w:cs="Times New Roman"/>
-          <w:sz w:val="18"/>
-          <w:szCs w:val="18"/>
-          <w:lang w:eastAsia="ko-KR"/>
-        </w:rPr>
-        <w:t xml:space="preserve"> </w:t>
-      </w:r>
-      <w:r>
-        <w:rPr>
-          <w:rFonts w:ascii="Times New Roman" w:eastAsia="바탕" w:hAnsi="Times New Roman" w:cs="Times New Roman"/>
-          <w:sz w:val="18"/>
-          <w:szCs w:val="18"/>
-          <w:lang w:eastAsia="ko-KR"/>
-        </w:rPr>
-        <w:t>유입</w:t>
-      </w:r>
-      <w:r>
-        <w:rPr>
-          <w:rFonts w:ascii="Times New Roman" w:eastAsia="바탕" w:hAnsi="Times New Roman" w:cs="Times New Roman"/>
-          <w:sz w:val="18"/>
-          <w:szCs w:val="18"/>
-          <w:lang w:eastAsia="ko-KR"/>
-        </w:rPr>
-        <w:t xml:space="preserve"> 299% </w:t>
-      </w:r>
-      <w:r>
-        <w:rPr>
-          <w:rFonts w:ascii="Times New Roman" w:eastAsia="바탕" w:hAnsi="Times New Roman" w:cs="Times New Roman"/>
-          <w:sz w:val="18"/>
-          <w:szCs w:val="18"/>
-          <w:lang w:eastAsia="ko-KR"/>
-        </w:rPr>
-        <w:t>성장</w:t>
-      </w:r>
-      <w:r>
-        <w:rPr>
-          <w:rFonts w:ascii="Times New Roman" w:eastAsia="바탕" w:hAnsi="Times New Roman" w:cs="Times New Roman"/>
+          <w:rFonts w:ascii="Times New Roman" w:eastAsia="바탕" w:hAnsi="Times New Roman" w:cs="Times New Roman" w:hint="eastAsia"/>
+          <w:sz w:val="18"/>
+          <w:szCs w:val="18"/>
+          <w:lang w:eastAsia="ko-KR"/>
+        </w:rPr>
+        <w:t xml:space="preserve"> </w:t>
+      </w:r>
+      <w:r>
+        <w:rPr>
+          <w:rFonts w:ascii="Times New Roman" w:eastAsia="바탕" w:hAnsi="Times New Roman" w:cs="Times New Roman" w:hint="eastAsia"/>
+          <w:sz w:val="18"/>
+          <w:szCs w:val="18"/>
+          <w:lang w:eastAsia="ko-KR"/>
+        </w:rPr>
+        <w:t>팔로우</w:t>
+      </w:r>
+      <w:r>
+        <w:rPr>
+          <w:rFonts w:ascii="Times New Roman" w:eastAsia="바탕" w:hAnsi="Times New Roman" w:cs="Times New Roman" w:hint="eastAsia"/>
+          <w:sz w:val="18"/>
+          <w:szCs w:val="18"/>
+          <w:lang w:eastAsia="ko-KR"/>
+        </w:rPr>
+        <w:t xml:space="preserve"> </w:t>
+      </w:r>
+      <w:r>
+        <w:rPr>
+          <w:rFonts w:ascii="Times New Roman" w:eastAsia="바탕" w:hAnsi="Times New Roman" w:cs="Times New Roman"/>
+          <w:sz w:val="18"/>
+          <w:szCs w:val="18"/>
+          <w:lang w:eastAsia="ko-KR"/>
+        </w:rPr>
+        <w:t>5,318</w:t>
+      </w:r>
+      <w:r>
+        <w:rPr>
+          <w:rFonts w:ascii="Times New Roman" w:eastAsia="바탕" w:hAnsi="Times New Roman" w:cs="Times New Roman"/>
+          <w:sz w:val="18"/>
+          <w:szCs w:val="18"/>
+          <w:lang w:eastAsia="ko-KR"/>
+        </w:rPr>
+        <w:t>건</w:t>
+      </w:r>
+      <w:r>
+        <w:rPr>
+          <w:rFonts w:ascii="Times New Roman" w:eastAsia="바탕" w:hAnsi="Times New Roman" w:cs="Times New Roman" w:hint="eastAsia"/>
+          <w:sz w:val="18"/>
+          <w:szCs w:val="18"/>
+          <w:lang w:eastAsia="ko-KR"/>
+        </w:rPr>
+        <w:t>,</w:t>
+      </w:r>
+      <w:r>
+        <w:rPr>
+          <w:rFonts w:ascii="Times New Roman" w:eastAsia="바탕" w:hAnsi="Times New Roman" w:cs="Times New Roman"/>
+          <w:sz w:val="18"/>
+          <w:szCs w:val="18"/>
+          <w:lang w:eastAsia="ko-KR"/>
+        </w:rPr>
+        <w:t xml:space="preserve"> </w:t>
+      </w:r>
+      <w:r>
+        <w:rPr>
+          <w:rFonts w:ascii="Times New Roman" w:eastAsia="바탕" w:hAnsi="Times New Roman" w:cs="Times New Roman"/>
+          <w:sz w:val="18"/>
+          <w:szCs w:val="18"/>
+          <w:lang w:eastAsia="ko-KR"/>
+        </w:rPr>
+        <w:t>해외</w:t>
+      </w:r>
+      <w:r>
+        <w:rPr>
+          <w:rFonts w:ascii="Times New Roman" w:eastAsia="바탕" w:hAnsi="Times New Roman" w:cs="Times New Roman" w:hint="eastAsia"/>
+          <w:sz w:val="18"/>
+          <w:szCs w:val="18"/>
+          <w:lang w:eastAsia="ko-KR"/>
+        </w:rPr>
+        <w:t xml:space="preserve"> </w:t>
+      </w:r>
+      <w:r>
+        <w:rPr>
+          <w:rFonts w:ascii="Times New Roman" w:eastAsia="바탕" w:hAnsi="Times New Roman" w:cs="Times New Roman" w:hint="eastAsia"/>
+          <w:sz w:val="18"/>
+          <w:szCs w:val="18"/>
+          <w:lang w:eastAsia="ko-KR"/>
+        </w:rPr>
+        <w:t>사전예약</w:t>
+      </w:r>
+      <w:r>
+        <w:rPr>
+          <w:rFonts w:ascii="Times New Roman" w:eastAsia="바탕" w:hAnsi="Times New Roman" w:cs="Times New Roman" w:hint="eastAsia"/>
+          <w:sz w:val="18"/>
+          <w:szCs w:val="18"/>
+          <w:lang w:eastAsia="ko-KR"/>
+        </w:rPr>
+        <w:t xml:space="preserve"> </w:t>
+      </w:r>
+      <w:r>
+        <w:rPr>
+          <w:rFonts w:ascii="Times New Roman" w:eastAsia="바탕" w:hAnsi="Times New Roman" w:cs="Times New Roman"/>
+          <w:sz w:val="18"/>
+          <w:szCs w:val="18"/>
+          <w:lang w:eastAsia="ko-KR"/>
+        </w:rPr>
+        <w:t>1</w:t>
+      </w:r>
+      <w:r>
+        <w:rPr>
+          <w:rFonts w:ascii="Times New Roman" w:eastAsia="바탕" w:hAnsi="Times New Roman" w:cs="Times New Roman"/>
+          <w:sz w:val="18"/>
+          <w:szCs w:val="18"/>
+          <w:lang w:eastAsia="ko-KR"/>
+        </w:rPr>
+        <w:t>만</w:t>
+      </w:r>
+      <w:r>
+        <w:rPr>
+          <w:rFonts w:ascii="Times New Roman" w:eastAsia="바탕" w:hAnsi="Times New Roman" w:cs="Times New Roman" w:hint="eastAsia"/>
+          <w:sz w:val="18"/>
+          <w:szCs w:val="18"/>
+          <w:lang w:eastAsia="ko-KR"/>
+        </w:rPr>
+        <w:t xml:space="preserve"> </w:t>
+      </w:r>
+      <w:r>
+        <w:rPr>
+          <w:rFonts w:ascii="Times New Roman" w:eastAsia="바탕" w:hAnsi="Times New Roman" w:cs="Times New Roman"/>
+          <w:sz w:val="18"/>
+          <w:szCs w:val="18"/>
+          <w:lang w:eastAsia="ko-KR"/>
+        </w:rPr>
+        <w:t>명</w:t>
+      </w:r>
+      <w:r>
+        <w:rPr>
+          <w:rFonts w:ascii="Times New Roman" w:eastAsia="바탕" w:hAnsi="Times New Roman" w:cs="Times New Roman" w:hint="eastAsia"/>
+          <w:sz w:val="18"/>
+          <w:szCs w:val="18"/>
+          <w:lang w:eastAsia="ko-KR"/>
+        </w:rPr>
+        <w:t xml:space="preserve"> </w:t>
+      </w:r>
+      <w:r>
+        <w:rPr>
+          <w:rFonts w:ascii="Times New Roman" w:eastAsia="바탕" w:hAnsi="Times New Roman" w:cs="Times New Roman" w:hint="eastAsia"/>
+          <w:sz w:val="18"/>
+          <w:szCs w:val="18"/>
+          <w:lang w:eastAsia="ko-KR"/>
+        </w:rPr>
+        <w:t>이상</w:t>
+      </w:r>
+      <w:r>
+        <w:rPr>
+          <w:rFonts w:ascii="Times New Roman" w:eastAsia="바탕" w:hAnsi="Times New Roman" w:cs="Times New Roman" w:hint="eastAsia"/>
+          <w:sz w:val="18"/>
+          <w:szCs w:val="18"/>
+          <w:lang w:eastAsia="ko-KR"/>
+        </w:rPr>
+        <w:t xml:space="preserve"> </w:t>
+      </w:r>
+      <w:r>
+        <w:rPr>
+          <w:rFonts w:ascii="Times New Roman" w:eastAsia="바탕" w:hAnsi="Times New Roman" w:cs="Times New Roman" w:hint="eastAsia"/>
+          <w:sz w:val="18"/>
+          <w:szCs w:val="18"/>
+          <w:lang w:eastAsia="ko-KR"/>
+        </w:rPr>
+        <w:t>확보</w:t>
+      </w:r>
+      <w:r>
+        <w:rPr>
+          <w:rFonts w:ascii="Times New Roman" w:eastAsia="바탕" w:hAnsi="Times New Roman" w:cs="Times New Roman" w:hint="eastAsia"/>
           <w:sz w:val="18"/>
           <w:szCs w:val="18"/>
           <w:lang w:eastAsia="ko-KR"/>
         </w:rPr>
         <w:t>.</w:t>
       </w:r>
+      <w:bookmarkStart w:id="1" w:name="_GoBack"/>
+      <w:bookmarkEnd w:id="1"/>
     </w:p>
     <w:p>
       <w:pPr>
@@ -2559,88 +2577,88 @@
           <w:szCs w:val="18"/>
           <w:lang w:eastAsia="ko-KR"/>
         </w:rPr>
-        <w:t>‘</w:t>
-      </w:r>
-      <w:r>
-        <w:rPr>
-          <w:rFonts w:ascii="Times New Roman" w:eastAsia="바탕" w:hAnsi="Times New Roman" w:cs="Times New Roman"/>
-          <w:sz w:val="18"/>
-          <w:szCs w:val="18"/>
-          <w:lang w:eastAsia="ko-KR"/>
-        </w:rPr>
-        <w:t>스스</w:t>
-      </w:r>
-      <w:r>
-        <w:rPr>
-          <w:rFonts w:ascii="Times New Roman" w:eastAsia="바탕" w:hAnsi="Times New Roman" w:cs="Times New Roman"/>
-          <w:sz w:val="18"/>
-          <w:szCs w:val="18"/>
-          <w:lang w:eastAsia="ko-KR"/>
-        </w:rPr>
-        <w:t xml:space="preserve"> </w:t>
-      </w:r>
-      <w:r>
-        <w:rPr>
-          <w:rFonts w:ascii="Times New Roman" w:eastAsia="바탕" w:hAnsi="Times New Roman" w:cs="Times New Roman"/>
-          <w:sz w:val="18"/>
-          <w:szCs w:val="18"/>
-          <w:lang w:eastAsia="ko-KR"/>
-        </w:rPr>
-        <w:t>매니저</w:t>
-      </w:r>
-      <w:r>
-        <w:rPr>
-          <w:rFonts w:ascii="Times New Roman" w:eastAsia="바탕" w:hAnsi="Times New Roman" w:cs="Times New Roman"/>
-          <w:sz w:val="18"/>
-          <w:szCs w:val="18"/>
-          <w:lang w:eastAsia="ko-KR"/>
-        </w:rPr>
-        <w:t xml:space="preserve">: </w:t>
-      </w:r>
-      <w:r>
-        <w:rPr>
-          <w:rFonts w:ascii="Times New Roman" w:eastAsia="바탕" w:hAnsi="Times New Roman" w:cs="Times New Roman"/>
-          <w:sz w:val="18"/>
-          <w:szCs w:val="18"/>
-          <w:lang w:eastAsia="ko-KR"/>
-        </w:rPr>
-        <w:t>뉴비대전</w:t>
-      </w:r>
-      <w:r>
-        <w:rPr>
-          <w:rFonts w:ascii="Times New Roman" w:eastAsia="바탕" w:hAnsi="Times New Roman" w:cs="Times New Roman"/>
-          <w:sz w:val="18"/>
-          <w:szCs w:val="18"/>
-          <w:lang w:eastAsia="ko-KR"/>
-        </w:rPr>
-        <w:t>’</w:t>
-      </w:r>
-      <w:r>
-        <w:rPr>
-          <w:rFonts w:ascii="Times New Roman" w:eastAsia="바탕" w:hAnsi="Times New Roman" w:cs="Times New Roman"/>
-          <w:sz w:val="18"/>
-          <w:szCs w:val="18"/>
-          <w:lang w:eastAsia="ko-KR"/>
-        </w:rPr>
-        <w:t>을</w:t>
-      </w:r>
-      <w:r>
-        <w:rPr>
-          <w:rFonts w:ascii="Times New Roman" w:eastAsia="바탕" w:hAnsi="Times New Roman" w:cs="Times New Roman"/>
-          <w:sz w:val="18"/>
-          <w:szCs w:val="18"/>
-          <w:lang w:eastAsia="ko-KR"/>
-        </w:rPr>
-        <w:t xml:space="preserve"> </w:t>
-      </w:r>
-      <w:r>
-        <w:rPr>
-          <w:rFonts w:ascii="Times New Roman" w:eastAsia="바탕" w:hAnsi="Times New Roman" w:cs="Times New Roman"/>
-          <w:sz w:val="18"/>
-          <w:szCs w:val="18"/>
-          <w:lang w:eastAsia="ko-KR"/>
-        </w:rPr>
-        <w:t>단독</w:t>
+        <w:t>P</w:t>
+      </w:r>
+      <w:r>
+        <w:rPr>
+          <w:rFonts w:ascii="Times New Roman" w:eastAsia="바탕" w:hAnsi="Times New Roman" w:cs="Times New Roman"/>
+          <w:sz w:val="18"/>
+          <w:szCs w:val="18"/>
+          <w:lang w:eastAsia="ko-KR"/>
+        </w:rPr>
+        <w:t>lay</w:t>
+      </w:r>
+      <w:r>
+        <w:rPr>
+          <w:rFonts w:ascii="Times New Roman" w:eastAsia="바탕" w:hAnsi="Times New Roman" w:cs="Times New Roman"/>
+          <w:sz w:val="18"/>
+          <w:szCs w:val="18"/>
+          <w:lang w:eastAsia="ko-KR"/>
+        </w:rPr>
+        <w:t>X4</w:t>
+      </w:r>
+      <w:r>
+        <w:rPr>
+          <w:rFonts w:ascii="Times New Roman" w:eastAsia="바탕" w:hAnsi="Times New Roman" w:cs="Times New Roman"/>
+          <w:sz w:val="18"/>
+          <w:szCs w:val="18"/>
+          <w:lang w:eastAsia="ko-KR"/>
+        </w:rPr>
+        <w:t>에서</w:t>
+      </w:r>
+      <w:r>
+        <w:rPr>
+          <w:rFonts w:ascii="Times New Roman" w:eastAsia="바탕" w:hAnsi="Times New Roman" w:cs="Times New Roman"/>
+          <w:sz w:val="18"/>
+          <w:szCs w:val="18"/>
+          <w:lang w:eastAsia="ko-KR"/>
+        </w:rPr>
+        <w:t xml:space="preserve"> ‘</w:t>
+      </w:r>
+      <w:r>
+        <w:rPr>
+          <w:rFonts w:ascii="Times New Roman" w:eastAsia="바탕" w:hAnsi="Times New Roman" w:cs="Times New Roman" w:hint="eastAsia"/>
+          <w:sz w:val="18"/>
+          <w:szCs w:val="18"/>
+          <w:lang w:eastAsia="ko-KR"/>
+        </w:rPr>
+        <w:t>S</w:t>
+      </w:r>
+      <w:r>
+        <w:rPr>
+          <w:rFonts w:ascii="Times New Roman" w:eastAsia="바탕" w:hAnsi="Times New Roman" w:cs="Times New Roman"/>
+          <w:sz w:val="18"/>
+          <w:szCs w:val="18"/>
+          <w:lang w:eastAsia="ko-KR"/>
+        </w:rPr>
+        <w:t xml:space="preserve">torm Striker’ </w:t>
+      </w:r>
+      <w:r>
+        <w:rPr>
+          <w:rFonts w:ascii="Times New Roman" w:eastAsia="바탕" w:hAnsi="Times New Roman" w:cs="Times New Roman"/>
+          <w:sz w:val="18"/>
+          <w:szCs w:val="18"/>
+          <w:lang w:eastAsia="ko-KR"/>
+        </w:rPr>
+        <w:t>부스의</w:t>
+      </w:r>
+      <w:r>
+        <w:rPr>
+          <w:rFonts w:ascii="Times New Roman" w:eastAsia="바탕" w:hAnsi="Times New Roman" w:cs="Times New Roman"/>
+          <w:sz w:val="18"/>
+          <w:szCs w:val="18"/>
+          <w:lang w:eastAsia="ko-KR"/>
+        </w:rPr>
+        <w:t xml:space="preserve"> </w:t>
+      </w:r>
+      <w:r>
+        <w:rPr>
+          <w:rFonts w:ascii="Times New Roman" w:eastAsia="바탕" w:hAnsi="Times New Roman" w:cs="Times New Roman"/>
+          <w:sz w:val="18"/>
+          <w:szCs w:val="18"/>
+          <w:lang w:eastAsia="ko-KR"/>
+        </w:rPr>
+        <w:t>콘텐츠</w:t>
       </w:r>
       <w:r>
         <w:rPr>
@@ -2676,6 +2694,186 @@
           <w:szCs w:val="18"/>
           <w:lang w:eastAsia="ko-KR"/>
         </w:rPr>
+        <w:t>참여</w:t>
+      </w:r>
+      <w:r>
+        <w:rPr>
+          <w:rFonts w:ascii="Times New Roman" w:eastAsia="바탕" w:hAnsi="Times New Roman" w:cs="Times New Roman"/>
+          <w:sz w:val="18"/>
+          <w:szCs w:val="18"/>
+          <w:lang w:eastAsia="ko-KR"/>
+        </w:rPr>
+        <w:t xml:space="preserve"> </w:t>
+      </w:r>
+      <w:r>
+        <w:rPr>
+          <w:rFonts w:ascii="Times New Roman" w:eastAsia="바탕" w:hAnsi="Times New Roman" w:cs="Times New Roman"/>
+          <w:sz w:val="18"/>
+          <w:szCs w:val="18"/>
+          <w:lang w:eastAsia="ko-KR"/>
+        </w:rPr>
+        <w:t>동선</w:t>
+      </w:r>
+      <w:r>
+        <w:rPr>
+          <w:rFonts w:ascii="Times New Roman" w:eastAsia="바탕" w:hAnsi="Times New Roman" w:cs="Times New Roman"/>
+          <w:sz w:val="18"/>
+          <w:szCs w:val="18"/>
+          <w:lang w:eastAsia="ko-KR"/>
+        </w:rPr>
+        <w:t xml:space="preserve">, </w:t>
+      </w:r>
+      <w:r>
+        <w:rPr>
+          <w:rFonts w:ascii="Times New Roman" w:eastAsia="바탕" w:hAnsi="Times New Roman" w:cs="Times New Roman"/>
+          <w:sz w:val="18"/>
+          <w:szCs w:val="18"/>
+          <w:lang w:eastAsia="ko-KR"/>
+        </w:rPr>
+        <w:t>인력</w:t>
+      </w:r>
+      <w:r>
+        <w:rPr>
+          <w:rFonts w:ascii="Times New Roman" w:eastAsia="바탕" w:hAnsi="Times New Roman" w:cs="Times New Roman"/>
+          <w:sz w:val="18"/>
+          <w:szCs w:val="18"/>
+          <w:lang w:eastAsia="ko-KR"/>
+        </w:rPr>
+        <w:t xml:space="preserve"> </w:t>
+      </w:r>
+      <w:r>
+        <w:rPr>
+          <w:rFonts w:ascii="Times New Roman" w:eastAsia="바탕" w:hAnsi="Times New Roman" w:cs="Times New Roman"/>
+          <w:sz w:val="18"/>
+          <w:szCs w:val="18"/>
+          <w:lang w:eastAsia="ko-KR"/>
+        </w:rPr>
+        <w:t>배치</w:t>
+      </w:r>
+      <w:r>
+        <w:rPr>
+          <w:rFonts w:ascii="Times New Roman" w:eastAsia="바탕" w:hAnsi="Times New Roman" w:cs="Times New Roman"/>
+          <w:sz w:val="18"/>
+          <w:szCs w:val="18"/>
+          <w:lang w:eastAsia="ko-KR"/>
+        </w:rPr>
+        <w:t xml:space="preserve">, </w:t>
+      </w:r>
+      <w:r>
+        <w:rPr>
+          <w:rFonts w:ascii="Times New Roman" w:eastAsia="바탕" w:hAnsi="Times New Roman" w:cs="Times New Roman"/>
+          <w:sz w:val="18"/>
+          <w:szCs w:val="18"/>
+          <w:lang w:eastAsia="ko-KR"/>
+        </w:rPr>
+        <w:t>이벤트</w:t>
+      </w:r>
+      <w:r>
+        <w:rPr>
+          <w:rFonts w:ascii="Times New Roman" w:eastAsia="바탕" w:hAnsi="Times New Roman" w:cs="Times New Roman"/>
+          <w:sz w:val="18"/>
+          <w:szCs w:val="18"/>
+          <w:lang w:eastAsia="ko-KR"/>
+        </w:rPr>
+        <w:t xml:space="preserve"> </w:t>
+      </w:r>
+      <w:r>
+        <w:rPr>
+          <w:rFonts w:ascii="Times New Roman" w:eastAsia="바탕" w:hAnsi="Times New Roman" w:cs="Times New Roman"/>
+          <w:sz w:val="18"/>
+          <w:szCs w:val="18"/>
+          <w:lang w:eastAsia="ko-KR"/>
+        </w:rPr>
+        <w:t>진행</w:t>
+      </w:r>
+      <w:r>
+        <w:rPr>
+          <w:rFonts w:ascii="Times New Roman" w:eastAsia="바탕" w:hAnsi="Times New Roman" w:cs="Times New Roman"/>
+          <w:sz w:val="18"/>
+          <w:szCs w:val="18"/>
+          <w:lang w:eastAsia="ko-KR"/>
+        </w:rPr>
+        <w:t xml:space="preserve"> </w:t>
+      </w:r>
+      <w:r>
+        <w:rPr>
+          <w:rFonts w:ascii="Times New Roman" w:eastAsia="바탕" w:hAnsi="Times New Roman" w:cs="Times New Roman"/>
+          <w:sz w:val="18"/>
+          <w:szCs w:val="18"/>
+          <w:lang w:eastAsia="ko-KR"/>
+        </w:rPr>
+        <w:t>및</w:t>
+      </w:r>
+      <w:r>
+        <w:rPr>
+          <w:rFonts w:ascii="Times New Roman" w:eastAsia="바탕" w:hAnsi="Times New Roman" w:cs="Times New Roman"/>
+          <w:sz w:val="18"/>
+          <w:szCs w:val="18"/>
+          <w:lang w:eastAsia="ko-KR"/>
+        </w:rPr>
+        <w:t xml:space="preserve"> </w:t>
+      </w:r>
+      <w:r>
+        <w:rPr>
+          <w:rFonts w:ascii="Times New Roman" w:eastAsia="바탕" w:hAnsi="Times New Roman" w:cs="Times New Roman"/>
+          <w:sz w:val="18"/>
+          <w:szCs w:val="18"/>
+          <w:lang w:eastAsia="ko-KR"/>
+        </w:rPr>
+        <w:t>현장</w:t>
+      </w:r>
+      <w:r>
+        <w:rPr>
+          <w:rFonts w:ascii="Times New Roman" w:eastAsia="바탕" w:hAnsi="Times New Roman" w:cs="Times New Roman"/>
+          <w:sz w:val="18"/>
+          <w:szCs w:val="18"/>
+          <w:lang w:eastAsia="ko-KR"/>
+        </w:rPr>
+        <w:t xml:space="preserve"> </w:t>
+      </w:r>
+      <w:r>
+        <w:rPr>
+          <w:rFonts w:ascii="Times New Roman" w:eastAsia="바탕" w:hAnsi="Times New Roman" w:cs="Times New Roman"/>
+          <w:sz w:val="18"/>
+          <w:szCs w:val="18"/>
+          <w:lang w:eastAsia="ko-KR"/>
+        </w:rPr>
+        <w:t>이슈</w:t>
+      </w:r>
+      <w:r>
+        <w:rPr>
+          <w:rFonts w:ascii="Times New Roman" w:eastAsia="바탕" w:hAnsi="Times New Roman" w:cs="Times New Roman"/>
+          <w:sz w:val="18"/>
+          <w:szCs w:val="18"/>
+          <w:lang w:eastAsia="ko-KR"/>
+        </w:rPr>
+        <w:t xml:space="preserve"> </w:t>
+      </w:r>
+      <w:r>
+        <w:rPr>
+          <w:rFonts w:ascii="Times New Roman" w:eastAsia="바탕" w:hAnsi="Times New Roman" w:cs="Times New Roman"/>
+          <w:sz w:val="18"/>
+          <w:szCs w:val="18"/>
+          <w:lang w:eastAsia="ko-KR"/>
+        </w:rPr>
+        <w:t>대응까지</w:t>
+      </w:r>
+      <w:r>
+        <w:rPr>
+          <w:rFonts w:ascii="Times New Roman" w:eastAsia="바탕" w:hAnsi="Times New Roman" w:cs="Times New Roman"/>
+          <w:sz w:val="18"/>
+          <w:szCs w:val="18"/>
+          <w:lang w:eastAsia="ko-KR"/>
+        </w:rPr>
+        <w:t xml:space="preserve"> </w:t>
+      </w:r>
+      <w:r>
+        <w:rPr>
+          <w:rFonts w:ascii="Times New Roman" w:eastAsia="바탕" w:hAnsi="Times New Roman" w:cs="Times New Roman"/>
+          <w:sz w:val="18"/>
+          <w:szCs w:val="18"/>
+          <w:lang w:eastAsia="ko-KR"/>
+        </w:rPr>
         <w:t>운영</w:t>
       </w:r>
       <w:r>
@@ -2713,240 +2911,6 @@
           <w:lang w:eastAsia="ko-KR"/>
         </w:rPr>
         <w:t>총괄</w:t>
-      </w:r>
-      <w:r>
-        <w:rPr>
-          <w:rFonts w:ascii="Times New Roman" w:eastAsia="바탕" w:hAnsi="Times New Roman" w:cs="Times New Roman"/>
-          <w:sz w:val="18"/>
-          <w:szCs w:val="18"/>
-          <w:lang w:eastAsia="ko-KR"/>
-        </w:rPr>
-        <w:t xml:space="preserve">. </w:t>
-      </w:r>
-      <w:r>
-        <w:rPr>
-          <w:rFonts w:ascii="Times New Roman" w:eastAsia="바탕" w:hAnsi="Times New Roman" w:cs="Times New Roman"/>
-          <w:sz w:val="18"/>
-          <w:szCs w:val="18"/>
-          <w:lang w:eastAsia="ko-KR"/>
-        </w:rPr>
-        <w:t>신구</w:t>
-      </w:r>
-      <w:r>
-        <w:rPr>
-          <w:rFonts w:ascii="Times New Roman" w:eastAsia="바탕" w:hAnsi="Times New Roman" w:cs="Times New Roman"/>
-          <w:sz w:val="18"/>
-          <w:szCs w:val="18"/>
-          <w:lang w:eastAsia="ko-KR"/>
-        </w:rPr>
-        <w:t xml:space="preserve"> </w:t>
-      </w:r>
-      <w:r>
-        <w:rPr>
-          <w:rFonts w:ascii="Times New Roman" w:eastAsia="바탕" w:hAnsi="Times New Roman" w:cs="Times New Roman"/>
-          <w:sz w:val="18"/>
-          <w:szCs w:val="18"/>
-          <w:lang w:eastAsia="ko-KR"/>
-        </w:rPr>
-        <w:t>유저</w:t>
-      </w:r>
-      <w:r>
-        <w:rPr>
-          <w:rFonts w:ascii="Times New Roman" w:eastAsia="바탕" w:hAnsi="Times New Roman" w:cs="Times New Roman"/>
-          <w:sz w:val="18"/>
-          <w:szCs w:val="18"/>
-          <w:lang w:eastAsia="ko-KR"/>
-        </w:rPr>
-        <w:t xml:space="preserve"> </w:t>
-      </w:r>
-      <w:r>
-        <w:rPr>
-          <w:rFonts w:ascii="Times New Roman" w:eastAsia="바탕" w:hAnsi="Times New Roman" w:cs="Times New Roman"/>
-          <w:sz w:val="18"/>
-          <w:szCs w:val="18"/>
-          <w:lang w:eastAsia="ko-KR"/>
-        </w:rPr>
-        <w:t>간</w:t>
-      </w:r>
-      <w:r>
-        <w:rPr>
-          <w:rFonts w:ascii="Times New Roman" w:eastAsia="바탕" w:hAnsi="Times New Roman" w:cs="Times New Roman"/>
-          <w:sz w:val="18"/>
-          <w:szCs w:val="18"/>
-          <w:lang w:eastAsia="ko-KR"/>
-        </w:rPr>
-        <w:t xml:space="preserve"> </w:t>
-      </w:r>
-      <w:r>
-        <w:rPr>
-          <w:rFonts w:ascii="Times New Roman" w:eastAsia="바탕" w:hAnsi="Times New Roman" w:cs="Times New Roman"/>
-          <w:sz w:val="18"/>
-          <w:szCs w:val="18"/>
-          <w:lang w:eastAsia="ko-KR"/>
-        </w:rPr>
-        <w:t>실력</w:t>
-      </w:r>
-      <w:r>
-        <w:rPr>
-          <w:rFonts w:ascii="Times New Roman" w:eastAsia="바탕" w:hAnsi="Times New Roman" w:cs="Times New Roman"/>
-          <w:sz w:val="18"/>
-          <w:szCs w:val="18"/>
-          <w:lang w:eastAsia="ko-KR"/>
-        </w:rPr>
-        <w:t xml:space="preserve"> </w:t>
-      </w:r>
-      <w:r>
-        <w:rPr>
-          <w:rFonts w:ascii="Times New Roman" w:eastAsia="바탕" w:hAnsi="Times New Roman" w:cs="Times New Roman"/>
-          <w:sz w:val="18"/>
-          <w:szCs w:val="18"/>
-          <w:lang w:eastAsia="ko-KR"/>
-        </w:rPr>
-        <w:t>격차</w:t>
-      </w:r>
-      <w:r>
-        <w:rPr>
-          <w:rFonts w:ascii="Times New Roman" w:eastAsia="바탕" w:hAnsi="Times New Roman" w:cs="Times New Roman"/>
-          <w:sz w:val="18"/>
-          <w:szCs w:val="18"/>
-          <w:lang w:eastAsia="ko-KR"/>
-        </w:rPr>
-        <w:t xml:space="preserve"> </w:t>
-      </w:r>
-      <w:r>
-        <w:rPr>
-          <w:rFonts w:ascii="Times New Roman" w:eastAsia="바탕" w:hAnsi="Times New Roman" w:cs="Times New Roman"/>
-          <w:sz w:val="18"/>
-          <w:szCs w:val="18"/>
-          <w:lang w:eastAsia="ko-KR"/>
-        </w:rPr>
-        <w:t>완화</w:t>
-      </w:r>
-      <w:r>
-        <w:rPr>
-          <w:rFonts w:ascii="Times New Roman" w:eastAsia="바탕" w:hAnsi="Times New Roman" w:cs="Times New Roman"/>
-          <w:sz w:val="18"/>
-          <w:szCs w:val="18"/>
-          <w:lang w:eastAsia="ko-KR"/>
-        </w:rPr>
-        <w:t xml:space="preserve">, </w:t>
-      </w:r>
-      <w:r>
-        <w:rPr>
-          <w:rFonts w:ascii="Times New Roman" w:eastAsia="바탕" w:hAnsi="Times New Roman" w:cs="Times New Roman"/>
-          <w:sz w:val="18"/>
-          <w:szCs w:val="18"/>
-          <w:lang w:eastAsia="ko-KR"/>
-        </w:rPr>
-        <w:t>신규</w:t>
-      </w:r>
-      <w:r>
-        <w:rPr>
-          <w:rFonts w:ascii="Times New Roman" w:eastAsia="바탕" w:hAnsi="Times New Roman" w:cs="Times New Roman"/>
-          <w:sz w:val="18"/>
-          <w:szCs w:val="18"/>
-          <w:lang w:eastAsia="ko-KR"/>
-        </w:rPr>
-        <w:t xml:space="preserve"> </w:t>
-      </w:r>
-      <w:r>
-        <w:rPr>
-          <w:rFonts w:ascii="Times New Roman" w:eastAsia="바탕" w:hAnsi="Times New Roman" w:cs="Times New Roman"/>
-          <w:sz w:val="18"/>
-          <w:szCs w:val="18"/>
-          <w:lang w:eastAsia="ko-KR"/>
-        </w:rPr>
-        <w:t>유저</w:t>
-      </w:r>
-      <w:r>
-        <w:rPr>
-          <w:rFonts w:ascii="Times New Roman" w:eastAsia="바탕" w:hAnsi="Times New Roman" w:cs="Times New Roman"/>
-          <w:sz w:val="18"/>
-          <w:szCs w:val="18"/>
-          <w:lang w:eastAsia="ko-KR"/>
-        </w:rPr>
-        <w:t xml:space="preserve"> </w:t>
-      </w:r>
-      <w:r>
-        <w:rPr>
-          <w:rFonts w:ascii="Times New Roman" w:eastAsia="바탕" w:hAnsi="Times New Roman" w:cs="Times New Roman"/>
-          <w:sz w:val="18"/>
-          <w:szCs w:val="18"/>
-          <w:lang w:eastAsia="ko-KR"/>
-        </w:rPr>
-        <w:t>잔존율을</w:t>
-      </w:r>
-      <w:r>
-        <w:rPr>
-          <w:rFonts w:ascii="Times New Roman" w:eastAsia="바탕" w:hAnsi="Times New Roman" w:cs="Times New Roman"/>
-          <w:sz w:val="18"/>
-          <w:szCs w:val="18"/>
-          <w:lang w:eastAsia="ko-KR"/>
-        </w:rPr>
-        <w:t xml:space="preserve"> </w:t>
-      </w:r>
-      <w:r>
-        <w:rPr>
-          <w:rFonts w:ascii="Times New Roman" w:eastAsia="바탕" w:hAnsi="Times New Roman" w:cs="Times New Roman"/>
-          <w:sz w:val="18"/>
-          <w:szCs w:val="18"/>
-          <w:lang w:eastAsia="ko-KR"/>
-        </w:rPr>
-        <w:t>약</w:t>
-      </w:r>
-      <w:r>
-        <w:rPr>
-          <w:rFonts w:ascii="Times New Roman" w:eastAsia="바탕" w:hAnsi="Times New Roman" w:cs="Times New Roman"/>
-          <w:sz w:val="18"/>
-          <w:szCs w:val="18"/>
-          <w:lang w:eastAsia="ko-KR"/>
-        </w:rPr>
-        <w:t xml:space="preserve"> 10%</w:t>
-      </w:r>
-      <w:r>
-        <w:rPr>
-          <w:rFonts w:ascii="Times New Roman" w:eastAsia="바탕" w:hAnsi="Times New Roman" w:cs="Times New Roman"/>
-          <w:sz w:val="18"/>
-          <w:szCs w:val="18"/>
-          <w:lang w:eastAsia="ko-KR"/>
-        </w:rPr>
-        <w:t>에서</w:t>
-      </w:r>
-      <w:r>
-        <w:rPr>
-          <w:rFonts w:ascii="Times New Roman" w:eastAsia="바탕" w:hAnsi="Times New Roman" w:cs="Times New Roman"/>
-          <w:sz w:val="18"/>
-          <w:szCs w:val="18"/>
-          <w:lang w:eastAsia="ko-KR"/>
-        </w:rPr>
-        <w:t xml:space="preserve"> 70%</w:t>
-      </w:r>
-      <w:r>
-        <w:rPr>
-          <w:rFonts w:ascii="Times New Roman" w:eastAsia="바탕" w:hAnsi="Times New Roman" w:cs="Times New Roman"/>
-          <w:sz w:val="18"/>
-          <w:szCs w:val="18"/>
-          <w:lang w:eastAsia="ko-KR"/>
-        </w:rPr>
-        <w:t>로</w:t>
-      </w:r>
-      <w:r>
-        <w:rPr>
-          <w:rFonts w:ascii="Times New Roman" w:eastAsia="바탕" w:hAnsi="Times New Roman" w:cs="Times New Roman"/>
-          <w:sz w:val="18"/>
-          <w:szCs w:val="18"/>
-          <w:lang w:eastAsia="ko-KR"/>
-        </w:rPr>
-        <w:t xml:space="preserve"> </w:t>
-      </w:r>
-      <w:r>
-        <w:rPr>
-          <w:rFonts w:ascii="Times New Roman" w:eastAsia="바탕" w:hAnsi="Times New Roman" w:cs="Times New Roman"/>
-          <w:sz w:val="18"/>
-          <w:szCs w:val="18"/>
-          <w:lang w:eastAsia="ko-KR"/>
-        </w:rPr>
-        <w:t>개선</w:t>
       </w:r>
       <w:r>
         <w:rPr>
@@ -2971,7 +2935,7 @@
         <w:spacing w:before="0" w:after="24" w:line="220" w:lineRule="exact"/>
         <w:ind w:left="697" w:hanging="187"/>
         <w:rPr>
-          <w:rFonts w:ascii="Times New Roman" w:eastAsia="바탕" w:hAnsi="Times New Roman" w:cs="Times New Roman"/>
+          <w:rFonts w:ascii="Times New Roman" w:eastAsia="바탕" w:hAnsi="Times New Roman" w:cs="Times New Roman" w:hint="eastAsia"/>
           <w:i/>
           <w:sz w:val="12"/>
           <w:lang w:eastAsia="ko-KR"/>
@@ -3065,24 +3029,6 @@
           <w:szCs w:val="18"/>
           <w:lang w:eastAsia="ko-KR"/>
         </w:rPr>
-        <w:t>최초</w:t>
-      </w:r>
-      <w:r>
-        <w:rPr>
-          <w:rFonts w:ascii="Times New Roman" w:eastAsia="바탕" w:hAnsi="Times New Roman" w:cs="Times New Roman"/>
-          <w:sz w:val="18"/>
-          <w:szCs w:val="18"/>
-          <w:lang w:eastAsia="ko-KR"/>
-        </w:rPr>
-        <w:t xml:space="preserve"> </w:t>
-      </w:r>
-      <w:r>
-        <w:rPr>
-          <w:rFonts w:ascii="Times New Roman" w:eastAsia="바탕" w:hAnsi="Times New Roman" w:cs="Times New Roman"/>
-          <w:sz w:val="18"/>
-          <w:szCs w:val="18"/>
-          <w:lang w:eastAsia="ko-KR"/>
-        </w:rPr>
         <w:t>기획</w:t>
       </w:r>
       <w:r>
@@ -3092,70 +3038,16 @@
           <w:szCs w:val="18"/>
           <w:lang w:eastAsia="ko-KR"/>
         </w:rPr>
-        <w:t xml:space="preserve">. MP </w:t>
-      </w:r>
-      <w:r>
-        <w:rPr>
-          <w:rFonts w:ascii="Times New Roman" w:eastAsia="바탕" w:hAnsi="Times New Roman" w:cs="Times New Roman"/>
-          <w:sz w:val="18"/>
-          <w:szCs w:val="18"/>
-          <w:lang w:eastAsia="ko-KR"/>
-        </w:rPr>
-        <w:t>획득</w:t>
-      </w:r>
-      <w:r>
-        <w:rPr>
-          <w:rFonts w:ascii="Times New Roman" w:eastAsia="바탕" w:hAnsi="Times New Roman" w:cs="Times New Roman"/>
-          <w:sz w:val="18"/>
-          <w:szCs w:val="18"/>
-          <w:lang w:eastAsia="ko-KR"/>
-        </w:rPr>
-        <w:t>/</w:t>
-      </w:r>
-      <w:r>
-        <w:rPr>
-          <w:rFonts w:ascii="Times New Roman" w:eastAsia="바탕" w:hAnsi="Times New Roman" w:cs="Times New Roman"/>
-          <w:sz w:val="18"/>
-          <w:szCs w:val="18"/>
-          <w:lang w:eastAsia="ko-KR"/>
-        </w:rPr>
-        <w:t>응모</w:t>
-      </w:r>
-      <w:r>
-        <w:rPr>
-          <w:rFonts w:ascii="Times New Roman" w:eastAsia="바탕" w:hAnsi="Times New Roman" w:cs="Times New Roman"/>
-          <w:sz w:val="18"/>
-          <w:szCs w:val="18"/>
-          <w:lang w:eastAsia="ko-KR"/>
-        </w:rPr>
-        <w:t>/</w:t>
-      </w:r>
-      <w:r>
-        <w:rPr>
-          <w:rFonts w:ascii="Times New Roman" w:eastAsia="바탕" w:hAnsi="Times New Roman" w:cs="Times New Roman"/>
-          <w:sz w:val="18"/>
-          <w:szCs w:val="18"/>
-          <w:lang w:eastAsia="ko-KR"/>
-        </w:rPr>
-        <w:t>보상</w:t>
-      </w:r>
-      <w:r>
-        <w:rPr>
-          <w:rFonts w:ascii="Times New Roman" w:eastAsia="바탕" w:hAnsi="Times New Roman" w:cs="Times New Roman"/>
-          <w:sz w:val="18"/>
-          <w:szCs w:val="18"/>
-          <w:lang w:eastAsia="ko-KR"/>
-        </w:rPr>
-        <w:t xml:space="preserve"> </w:t>
-      </w:r>
-      <w:r>
-        <w:rPr>
-          <w:rFonts w:ascii="Times New Roman" w:eastAsia="바탕" w:hAnsi="Times New Roman" w:cs="Times New Roman"/>
-          <w:sz w:val="18"/>
-          <w:szCs w:val="18"/>
-          <w:lang w:eastAsia="ko-KR"/>
-        </w:rPr>
-        <w:t>구조로</w:t>
+        <w:t>하여</w:t>
+      </w:r>
+      <w:r>
+        <w:rPr>
+          <w:rFonts w:ascii="Times New Roman" w:eastAsia="바탕" w:hAnsi="Times New Roman" w:cs="Times New Roman" w:hint="eastAsia"/>
+          <w:sz w:val="18"/>
+          <w:szCs w:val="18"/>
+          <w:lang w:eastAsia="ko-KR"/>
+        </w:rPr>
+        <w:t>,</w:t>
       </w:r>
       <w:r>
         <w:rPr>
@@ -3177,16 +3069,16 @@
       </w:r>
       <w:r>
         <w:rPr>
-          <w:rFonts w:ascii="Times New Roman" w:eastAsia="바탕" w:hAnsi="Times New Roman" w:cs="Times New Roman"/>
-          <w:sz w:val="18"/>
-          <w:szCs w:val="18"/>
-          <w:lang w:eastAsia="ko-KR"/>
-        </w:rPr>
-        <w:t xml:space="preserve"> </w:t>
-      </w:r>
-      <w:r>
-        <w:rPr>
-          <w:rFonts w:ascii="Times New Roman" w:eastAsia="바탕" w:hAnsi="Times New Roman" w:cs="Times New Roman"/>
+          <w:rFonts w:ascii="Times New Roman" w:eastAsia="바탕" w:hAnsi="Times New Roman" w:cs="Times New Roman" w:hint="eastAsia"/>
+          <w:sz w:val="18"/>
+          <w:szCs w:val="18"/>
+          <w:lang w:eastAsia="ko-KR"/>
+        </w:rPr>
+        <w:t xml:space="preserve"> </w:t>
+      </w:r>
+      <w:r>
+        <w:rPr>
+          <w:rFonts w:ascii="Times New Roman" w:eastAsia="바탕" w:hAnsi="Times New Roman" w:cs="Times New Roman" w:hint="eastAsia"/>
           <w:sz w:val="18"/>
           <w:szCs w:val="18"/>
           <w:lang w:eastAsia="ko-KR"/>
@@ -3195,34 +3087,34 @@
       </w:r>
       <w:r>
         <w:rPr>
-          <w:rFonts w:ascii="Times New Roman" w:eastAsia="바탕" w:hAnsi="Times New Roman" w:cs="Times New Roman"/>
-          <w:sz w:val="18"/>
-          <w:szCs w:val="18"/>
-          <w:lang w:eastAsia="ko-KR"/>
-        </w:rPr>
-        <w:t xml:space="preserve"> </w:t>
-      </w:r>
-      <w:r>
-        <w:rPr>
-          <w:rFonts w:ascii="Times New Roman" w:eastAsia="바탕" w:hAnsi="Times New Roman" w:cs="Times New Roman"/>
-          <w:sz w:val="18"/>
-          <w:szCs w:val="18"/>
-          <w:lang w:eastAsia="ko-KR"/>
-        </w:rPr>
-        <w:t>유도</w:t>
-      </w:r>
-      <w:r>
-        <w:rPr>
-          <w:rFonts w:ascii="Times New Roman" w:eastAsia="바탕" w:hAnsi="Times New Roman" w:cs="Times New Roman"/>
-          <w:sz w:val="18"/>
-          <w:szCs w:val="18"/>
-          <w:lang w:eastAsia="ko-KR"/>
-        </w:rPr>
-        <w:t xml:space="preserve">. </w:t>
-      </w:r>
-      <w:r>
-        <w:rPr>
-          <w:rFonts w:ascii="Times New Roman" w:eastAsia="바탕" w:hAnsi="Times New Roman" w:cs="Times New Roman"/>
+          <w:rFonts w:ascii="Times New Roman" w:eastAsia="바탕" w:hAnsi="Times New Roman" w:cs="Times New Roman" w:hint="eastAsia"/>
+          <w:sz w:val="18"/>
+          <w:szCs w:val="18"/>
+          <w:lang w:eastAsia="ko-KR"/>
+        </w:rPr>
+        <w:t xml:space="preserve"> </w:t>
+      </w:r>
+      <w:r>
+        <w:rPr>
+          <w:rFonts w:ascii="Times New Roman" w:eastAsia="바탕" w:hAnsi="Times New Roman" w:cs="Times New Roman" w:hint="eastAsia"/>
+          <w:sz w:val="18"/>
+          <w:szCs w:val="18"/>
+          <w:lang w:eastAsia="ko-KR"/>
+        </w:rPr>
+        <w:t>유도해</w:t>
+      </w:r>
+      <w:r>
+        <w:rPr>
+          <w:rFonts w:ascii="Times New Roman" w:eastAsia="바탕" w:hAnsi="Times New Roman" w:cs="Times New Roman" w:hint="eastAsia"/>
+          <w:sz w:val="18"/>
+          <w:szCs w:val="18"/>
+          <w:lang w:eastAsia="ko-KR"/>
+        </w:rPr>
+        <w:t xml:space="preserve"> </w:t>
+      </w:r>
+      <w:r>
+        <w:rPr>
+          <w:rFonts w:ascii="Times New Roman" w:eastAsia="바탕" w:hAnsi="Times New Roman" w:cs="Times New Roman" w:hint="eastAsia"/>
           <w:sz w:val="18"/>
           <w:szCs w:val="18"/>
           <w:lang w:eastAsia="ko-KR"/>
@@ -3231,16 +3123,16 @@
       </w:r>
       <w:r>
         <w:rPr>
-          <w:rFonts w:ascii="Times New Roman" w:eastAsia="바탕" w:hAnsi="Times New Roman" w:cs="Times New Roman"/>
-          <w:sz w:val="18"/>
-          <w:szCs w:val="18"/>
-          <w:lang w:eastAsia="ko-KR"/>
-        </w:rPr>
-        <w:t xml:space="preserve"> </w:t>
-      </w:r>
-      <w:r>
-        <w:rPr>
-          <w:rFonts w:ascii="Times New Roman" w:eastAsia="바탕" w:hAnsi="Times New Roman" w:cs="Times New Roman"/>
+          <w:rFonts w:ascii="Times New Roman" w:eastAsia="바탕" w:hAnsi="Times New Roman" w:cs="Times New Roman" w:hint="eastAsia"/>
+          <w:sz w:val="18"/>
+          <w:szCs w:val="18"/>
+          <w:lang w:eastAsia="ko-KR"/>
+        </w:rPr>
+        <w:t xml:space="preserve"> </w:t>
+      </w:r>
+      <w:r>
+        <w:rPr>
+          <w:rFonts w:ascii="Times New Roman" w:eastAsia="바탕" w:hAnsi="Times New Roman" w:cs="Times New Roman" w:hint="eastAsia"/>
           <w:sz w:val="18"/>
           <w:szCs w:val="18"/>
           <w:lang w:eastAsia="ko-KR"/>
@@ -3249,16 +3141,16 @@
       </w:r>
       <w:r>
         <w:rPr>
-          <w:rFonts w:ascii="Times New Roman" w:eastAsia="바탕" w:hAnsi="Times New Roman" w:cs="Times New Roman"/>
-          <w:sz w:val="18"/>
-          <w:szCs w:val="18"/>
-          <w:lang w:eastAsia="ko-KR"/>
-        </w:rPr>
-        <w:t xml:space="preserve"> </w:t>
-      </w:r>
-      <w:r>
-        <w:rPr>
-          <w:rFonts w:ascii="Times New Roman" w:eastAsia="바탕" w:hAnsi="Times New Roman" w:cs="Times New Roman"/>
+          <w:rFonts w:ascii="Times New Roman" w:eastAsia="바탕" w:hAnsi="Times New Roman" w:cs="Times New Roman" w:hint="eastAsia"/>
+          <w:sz w:val="18"/>
+          <w:szCs w:val="18"/>
+          <w:lang w:eastAsia="ko-KR"/>
+        </w:rPr>
+        <w:t xml:space="preserve"> </w:t>
+      </w:r>
+      <w:r>
+        <w:rPr>
+          <w:rFonts w:ascii="Times New Roman" w:eastAsia="바탕" w:hAnsi="Times New Roman" w:cs="Times New Roman" w:hint="eastAsia"/>
           <w:sz w:val="18"/>
           <w:szCs w:val="18"/>
           <w:lang w:eastAsia="ko-KR"/>
@@ -3267,16 +3159,16 @@
       </w:r>
       <w:r>
         <w:rPr>
-          <w:rFonts w:ascii="Times New Roman" w:eastAsia="바탕" w:hAnsi="Times New Roman" w:cs="Times New Roman"/>
-          <w:sz w:val="18"/>
-          <w:szCs w:val="18"/>
-          <w:lang w:eastAsia="ko-KR"/>
-        </w:rPr>
-        <w:t xml:space="preserve"> </w:t>
-      </w:r>
-      <w:r>
-        <w:rPr>
-          <w:rFonts w:ascii="Times New Roman" w:eastAsia="바탕" w:hAnsi="Times New Roman" w:cs="Times New Roman"/>
+          <w:rFonts w:ascii="Times New Roman" w:eastAsia="바탕" w:hAnsi="Times New Roman" w:cs="Times New Roman" w:hint="eastAsia"/>
+          <w:sz w:val="18"/>
+          <w:szCs w:val="18"/>
+          <w:lang w:eastAsia="ko-KR"/>
+        </w:rPr>
+        <w:t xml:space="preserve"> </w:t>
+      </w:r>
+      <w:r>
+        <w:rPr>
+          <w:rFonts w:ascii="Times New Roman" w:eastAsia="바탕" w:hAnsi="Times New Roman" w:cs="Times New Roman" w:hint="eastAsia"/>
           <w:sz w:val="18"/>
           <w:szCs w:val="18"/>
           <w:lang w:eastAsia="ko-KR"/>
@@ -3285,12 +3177,21 @@
       </w:r>
       <w:r>
         <w:rPr>
-          <w:rFonts w:ascii="Times New Roman" w:eastAsia="바탕" w:hAnsi="Times New Roman" w:cs="Times New Roman"/>
-          <w:sz w:val="18"/>
-          <w:szCs w:val="18"/>
-          <w:lang w:eastAsia="ko-KR"/>
-        </w:rPr>
-        <w:t xml:space="preserve"> 4</w:t>
+          <w:rFonts w:ascii="Times New Roman" w:eastAsia="바탕" w:hAnsi="Times New Roman" w:cs="Times New Roman" w:hint="eastAsia"/>
+          <w:sz w:val="18"/>
+          <w:szCs w:val="18"/>
+          <w:lang w:eastAsia="ko-KR"/>
+        </w:rPr>
+        <w:t xml:space="preserve"> </w:t>
+      </w:r>
+      <w:r>
+        <w:rPr>
+          <w:rFonts w:ascii="Times New Roman" w:eastAsia="바탕" w:hAnsi="Times New Roman" w:cs="Times New Roman"/>
+          <w:sz w:val="18"/>
+          <w:szCs w:val="18"/>
+          <w:lang w:eastAsia="ko-KR"/>
+        </w:rPr>
+        <w:t>4</w:t>
       </w:r>
       <w:r>
         <w:rPr>
@@ -3303,16 +3204,16 @@
       </w:r>
       <w:r>
         <w:rPr>
-          <w:rFonts w:ascii="Times New Roman" w:eastAsia="바탕" w:hAnsi="Times New Roman" w:cs="Times New Roman"/>
-          <w:sz w:val="18"/>
-          <w:szCs w:val="18"/>
-          <w:lang w:eastAsia="ko-KR"/>
-        </w:rPr>
-        <w:t xml:space="preserve"> </w:t>
-      </w:r>
-      <w:r>
-        <w:rPr>
-          <w:rFonts w:ascii="Times New Roman" w:eastAsia="바탕" w:hAnsi="Times New Roman" w:cs="Times New Roman"/>
+          <w:rFonts w:ascii="Times New Roman" w:eastAsia="바탕" w:hAnsi="Times New Roman" w:cs="Times New Roman" w:hint="eastAsia"/>
+          <w:sz w:val="18"/>
+          <w:szCs w:val="18"/>
+          <w:lang w:eastAsia="ko-KR"/>
+        </w:rPr>
+        <w:t xml:space="preserve"> </w:t>
+      </w:r>
+      <w:r>
+        <w:rPr>
+          <w:rFonts w:ascii="Times New Roman" w:eastAsia="바탕" w:hAnsi="Times New Roman" w:cs="Times New Roman" w:hint="eastAsia"/>
           <w:sz w:val="18"/>
           <w:szCs w:val="18"/>
           <w:lang w:eastAsia="ko-KR"/>
@@ -3321,7 +3222,7 @@
       </w:r>
       <w:r>
         <w:rPr>
-          <w:rFonts w:ascii="Times New Roman" w:eastAsia="바탕" w:hAnsi="Times New Roman" w:cs="Times New Roman"/>
+          <w:rFonts w:ascii="Times New Roman" w:eastAsia="바탕" w:hAnsi="Times New Roman" w:cs="Times New Roman" w:hint="eastAsia"/>
           <w:sz w:val="18"/>
           <w:szCs w:val="18"/>
           <w:lang w:eastAsia="ko-KR"/>
@@ -3342,7 +3243,7 @@
         <w:spacing w:before="0" w:after="24" w:line="220" w:lineRule="exact"/>
         <w:ind w:left="697" w:hanging="187"/>
         <w:rPr>
-          <w:rFonts w:ascii="Times New Roman" w:eastAsia="바탕" w:hAnsi="Times New Roman" w:cs="Times New Roman"/>
+          <w:rFonts w:ascii="Times New Roman" w:eastAsia="바탕" w:hAnsi="Times New Roman" w:cs="Times New Roman" w:hint="eastAsia"/>
           <w:i/>
           <w:sz w:val="12"/>
           <w:lang w:eastAsia="ko-KR"/>
@@ -3355,272 +3256,281 @@
           <w:szCs w:val="18"/>
           <w:lang w:eastAsia="ko-KR"/>
         </w:rPr>
-        <w:t>운영</w:t>
-      </w:r>
-      <w:r>
-        <w:rPr>
-          <w:rFonts w:ascii="Times New Roman" w:eastAsia="바탕" w:hAnsi="Times New Roman" w:cs="Times New Roman"/>
-          <w:sz w:val="18"/>
-          <w:szCs w:val="18"/>
-          <w:lang w:eastAsia="ko-KR"/>
-        </w:rPr>
-        <w:t xml:space="preserve"> </w:t>
-      </w:r>
-      <w:r>
-        <w:rPr>
-          <w:rFonts w:ascii="Times New Roman" w:eastAsia="바탕" w:hAnsi="Times New Roman" w:cs="Times New Roman"/>
-          <w:sz w:val="18"/>
-          <w:szCs w:val="18"/>
-          <w:lang w:eastAsia="ko-KR"/>
-        </w:rPr>
-        <w:t>전략을</w:t>
-      </w:r>
-      <w:r>
-        <w:rPr>
-          <w:rFonts w:ascii="Times New Roman" w:eastAsia="바탕" w:hAnsi="Times New Roman" w:cs="Times New Roman"/>
-          <w:sz w:val="18"/>
-          <w:szCs w:val="18"/>
-          <w:lang w:eastAsia="ko-KR"/>
-        </w:rPr>
-        <w:t xml:space="preserve"> </w:t>
-      </w:r>
-      <w:r>
-        <w:rPr>
-          <w:rFonts w:ascii="Times New Roman" w:eastAsia="바탕" w:hAnsi="Times New Roman" w:cs="Times New Roman"/>
-          <w:sz w:val="18"/>
-          <w:szCs w:val="18"/>
-          <w:lang w:eastAsia="ko-KR"/>
-        </w:rPr>
-        <w:t>주도하여</w:t>
-      </w:r>
-      <w:r>
-        <w:rPr>
-          <w:rFonts w:ascii="Times New Roman" w:eastAsia="바탕" w:hAnsi="Times New Roman" w:cs="Times New Roman"/>
-          <w:sz w:val="18"/>
-          <w:szCs w:val="18"/>
-          <w:lang w:eastAsia="ko-KR"/>
-        </w:rPr>
-        <w:t xml:space="preserve"> </w:t>
-      </w:r>
-      <w:r>
-        <w:rPr>
-          <w:rFonts w:ascii="Times New Roman" w:eastAsia="바탕" w:hAnsi="Times New Roman" w:cs="Times New Roman"/>
-          <w:sz w:val="18"/>
-          <w:szCs w:val="18"/>
-          <w:lang w:eastAsia="ko-KR"/>
-        </w:rPr>
-        <w:t>입사</w:t>
-      </w:r>
-      <w:r>
-        <w:rPr>
-          <w:rFonts w:ascii="Times New Roman" w:eastAsia="바탕" w:hAnsi="Times New Roman" w:cs="Times New Roman"/>
-          <w:sz w:val="18"/>
-          <w:szCs w:val="18"/>
-          <w:lang w:eastAsia="ko-KR"/>
-        </w:rPr>
-        <w:t xml:space="preserve"> </w:t>
-      </w:r>
-      <w:r>
-        <w:rPr>
-          <w:rFonts w:ascii="Times New Roman" w:eastAsia="바탕" w:hAnsi="Times New Roman" w:cs="Times New Roman"/>
-          <w:sz w:val="18"/>
-          <w:szCs w:val="18"/>
-          <w:lang w:eastAsia="ko-KR"/>
-        </w:rPr>
-        <w:t>4</w:t>
-      </w:r>
-      <w:r>
-        <w:rPr>
-          <w:rFonts w:ascii="Times New Roman" w:eastAsia="바탕" w:hAnsi="Times New Roman" w:cs="Times New Roman"/>
-          <w:sz w:val="18"/>
-          <w:szCs w:val="18"/>
-          <w:lang w:eastAsia="ko-KR"/>
-        </w:rPr>
-        <w:t>개월</w:t>
-      </w:r>
-      <w:r>
-        <w:rPr>
-          <w:rFonts w:ascii="Times New Roman" w:eastAsia="바탕" w:hAnsi="Times New Roman" w:cs="Times New Roman"/>
-          <w:sz w:val="18"/>
-          <w:szCs w:val="18"/>
-          <w:lang w:eastAsia="ko-KR"/>
-        </w:rPr>
-        <w:t xml:space="preserve"> </w:t>
-      </w:r>
-      <w:r>
-        <w:rPr>
-          <w:rFonts w:ascii="Times New Roman" w:eastAsia="바탕" w:hAnsi="Times New Roman" w:cs="Times New Roman"/>
-          <w:sz w:val="18"/>
-          <w:szCs w:val="18"/>
-          <w:lang w:eastAsia="ko-KR"/>
-        </w:rPr>
-        <w:t>만에</w:t>
-      </w:r>
-      <w:r>
-        <w:rPr>
-          <w:rFonts w:ascii="Times New Roman" w:eastAsia="바탕" w:hAnsi="Times New Roman" w:cs="Times New Roman"/>
-          <w:sz w:val="18"/>
-          <w:szCs w:val="18"/>
-          <w:lang w:eastAsia="ko-KR"/>
-        </w:rPr>
-        <w:t xml:space="preserve"> </w:t>
-      </w:r>
-      <w:r>
-        <w:rPr>
-          <w:rFonts w:ascii="Times New Roman" w:eastAsia="바탕" w:hAnsi="Times New Roman" w:cs="Times New Roman"/>
-          <w:sz w:val="18"/>
-          <w:szCs w:val="18"/>
-          <w:lang w:eastAsia="ko-KR"/>
-        </w:rPr>
-        <w:t>약</w:t>
-      </w:r>
-      <w:r>
-        <w:rPr>
-          <w:rFonts w:ascii="Times New Roman" w:eastAsia="바탕" w:hAnsi="Times New Roman" w:cs="Times New Roman"/>
-          <w:sz w:val="18"/>
-          <w:szCs w:val="18"/>
-          <w:lang w:eastAsia="ko-KR"/>
-        </w:rPr>
-        <w:t xml:space="preserve"> 3</w:t>
-      </w:r>
-      <w:r>
-        <w:rPr>
-          <w:rFonts w:ascii="Times New Roman" w:eastAsia="바탕" w:hAnsi="Times New Roman" w:cs="Times New Roman"/>
-          <w:sz w:val="18"/>
-          <w:szCs w:val="18"/>
-          <w:lang w:eastAsia="ko-KR"/>
-        </w:rPr>
-        <w:t>년간</w:t>
-      </w:r>
-      <w:r>
-        <w:rPr>
-          <w:rFonts w:ascii="Times New Roman" w:eastAsia="바탕" w:hAnsi="Times New Roman" w:cs="Times New Roman"/>
-          <w:sz w:val="18"/>
-          <w:szCs w:val="18"/>
-          <w:lang w:eastAsia="ko-KR"/>
-        </w:rPr>
-        <w:t xml:space="preserve"> </w:t>
-      </w:r>
-      <w:r>
-        <w:rPr>
-          <w:rFonts w:ascii="Times New Roman" w:eastAsia="바탕" w:hAnsi="Times New Roman" w:cs="Times New Roman"/>
-          <w:sz w:val="18"/>
-          <w:szCs w:val="18"/>
-          <w:lang w:eastAsia="ko-KR"/>
-        </w:rPr>
-        <w:t>이어진</w:t>
-      </w:r>
-      <w:r>
-        <w:rPr>
-          <w:rFonts w:ascii="Times New Roman" w:eastAsia="바탕" w:hAnsi="Times New Roman" w:cs="Times New Roman"/>
-          <w:sz w:val="18"/>
-          <w:szCs w:val="18"/>
-          <w:lang w:eastAsia="ko-KR"/>
-        </w:rPr>
-        <w:t xml:space="preserve"> </w:t>
-      </w:r>
-      <w:r>
-        <w:rPr>
-          <w:rFonts w:ascii="Times New Roman" w:eastAsia="바탕" w:hAnsi="Times New Roman" w:cs="Times New Roman"/>
-          <w:sz w:val="18"/>
-          <w:szCs w:val="18"/>
-          <w:lang w:eastAsia="ko-KR"/>
-        </w:rPr>
-        <w:t>게임</w:t>
-      </w:r>
-      <w:r>
-        <w:rPr>
-          <w:rFonts w:ascii="Times New Roman" w:eastAsia="바탕" w:hAnsi="Times New Roman" w:cs="Times New Roman"/>
-          <w:sz w:val="18"/>
-          <w:szCs w:val="18"/>
-          <w:lang w:eastAsia="ko-KR"/>
-        </w:rPr>
-        <w:t xml:space="preserve"> </w:t>
-      </w:r>
-      <w:r>
-        <w:rPr>
-          <w:rFonts w:ascii="Times New Roman" w:eastAsia="바탕" w:hAnsi="Times New Roman" w:cs="Times New Roman"/>
-          <w:sz w:val="18"/>
-          <w:szCs w:val="18"/>
-          <w:lang w:eastAsia="ko-KR"/>
-        </w:rPr>
-        <w:t>서비스의</w:t>
-      </w:r>
-      <w:r>
-        <w:rPr>
-          <w:rFonts w:ascii="Times New Roman" w:eastAsia="바탕" w:hAnsi="Times New Roman" w:cs="Times New Roman"/>
-          <w:sz w:val="18"/>
-          <w:szCs w:val="18"/>
-          <w:lang w:eastAsia="ko-KR"/>
-        </w:rPr>
-        <w:t xml:space="preserve"> </w:t>
-      </w:r>
-      <w:r>
-        <w:rPr>
-          <w:rFonts w:ascii="Times New Roman" w:eastAsia="바탕" w:hAnsi="Times New Roman" w:cs="Times New Roman"/>
-          <w:sz w:val="18"/>
-          <w:szCs w:val="18"/>
-          <w:lang w:eastAsia="ko-KR"/>
-        </w:rPr>
-        <w:t>최고</w:t>
-      </w:r>
-      <w:r>
-        <w:rPr>
-          <w:rFonts w:ascii="Times New Roman" w:eastAsia="바탕" w:hAnsi="Times New Roman" w:cs="Times New Roman"/>
-          <w:sz w:val="18"/>
-          <w:szCs w:val="18"/>
-          <w:lang w:eastAsia="ko-KR"/>
-        </w:rPr>
-        <w:t xml:space="preserve"> </w:t>
-      </w:r>
-      <w:r>
-        <w:rPr>
-          <w:rFonts w:ascii="Times New Roman" w:eastAsia="바탕" w:hAnsi="Times New Roman" w:cs="Times New Roman"/>
-          <w:sz w:val="18"/>
-          <w:szCs w:val="18"/>
-          <w:lang w:eastAsia="ko-KR"/>
-        </w:rPr>
-        <w:t>동시접속자</w:t>
-      </w:r>
-      <w:r>
-        <w:rPr>
-          <w:rFonts w:ascii="Times New Roman" w:eastAsia="바탕" w:hAnsi="Times New Roman" w:cs="Times New Roman"/>
-          <w:sz w:val="18"/>
-          <w:szCs w:val="18"/>
-          <w:lang w:eastAsia="ko-KR"/>
-        </w:rPr>
-        <w:t xml:space="preserve"> </w:t>
-      </w:r>
-      <w:r>
-        <w:rPr>
-          <w:rFonts w:ascii="Times New Roman" w:eastAsia="바탕" w:hAnsi="Times New Roman" w:cs="Times New Roman"/>
-          <w:sz w:val="18"/>
-          <w:szCs w:val="18"/>
-          <w:lang w:eastAsia="ko-KR"/>
-        </w:rPr>
-        <w:t>기록을</w:t>
-      </w:r>
-      <w:r>
-        <w:rPr>
-          <w:rFonts w:ascii="Times New Roman" w:eastAsia="바탕" w:hAnsi="Times New Roman" w:cs="Times New Roman"/>
-          <w:sz w:val="18"/>
-          <w:szCs w:val="18"/>
-          <w:lang w:eastAsia="ko-KR"/>
-        </w:rPr>
-        <w:t xml:space="preserve"> </w:t>
-      </w:r>
-      <w:r>
-        <w:rPr>
-          <w:rFonts w:ascii="Times New Roman" w:eastAsia="바탕" w:hAnsi="Times New Roman" w:cs="Times New Roman"/>
-          <w:sz w:val="18"/>
-          <w:szCs w:val="18"/>
-          <w:lang w:eastAsia="ko-KR"/>
-        </w:rPr>
-        <w:t>갱신</w:t>
-      </w:r>
-      <w:r>
-        <w:rPr>
-          <w:rFonts w:ascii="Times New Roman" w:eastAsia="바탕" w:hAnsi="Times New Roman" w:cs="Times New Roman"/>
+        <w:t xml:space="preserve"> </w:t>
+      </w:r>
+      <w:r>
+        <w:rPr>
+          <w:rFonts w:ascii="Times New Roman" w:eastAsia="바탕" w:hAnsi="Times New Roman" w:cs="Times New Roman"/>
+          <w:sz w:val="18"/>
+          <w:szCs w:val="18"/>
+          <w:lang w:eastAsia="ko-KR"/>
+        </w:rPr>
+        <w:t>‘</w:t>
+      </w:r>
+      <w:r>
+        <w:rPr>
+          <w:rFonts w:ascii="Times New Roman" w:eastAsia="바탕" w:hAnsi="Times New Roman" w:cs="Times New Roman"/>
+          <w:sz w:val="18"/>
+          <w:szCs w:val="18"/>
+          <w:lang w:eastAsia="ko-KR"/>
+        </w:rPr>
+        <w:t>스스</w:t>
+      </w:r>
+      <w:r>
+        <w:rPr>
+          <w:rFonts w:ascii="Times New Roman" w:eastAsia="바탕" w:hAnsi="Times New Roman" w:cs="Times New Roman"/>
+          <w:sz w:val="18"/>
+          <w:szCs w:val="18"/>
+          <w:lang w:eastAsia="ko-KR"/>
+        </w:rPr>
+        <w:t xml:space="preserve"> </w:t>
+      </w:r>
+      <w:r>
+        <w:rPr>
+          <w:rFonts w:ascii="Times New Roman" w:eastAsia="바탕" w:hAnsi="Times New Roman" w:cs="Times New Roman"/>
+          <w:sz w:val="18"/>
+          <w:szCs w:val="18"/>
+          <w:lang w:eastAsia="ko-KR"/>
+        </w:rPr>
+        <w:t>매니저</w:t>
+      </w:r>
+      <w:r>
+        <w:rPr>
+          <w:rFonts w:ascii="Times New Roman" w:eastAsia="바탕" w:hAnsi="Times New Roman" w:cs="Times New Roman"/>
+          <w:sz w:val="18"/>
+          <w:szCs w:val="18"/>
+          <w:lang w:eastAsia="ko-KR"/>
+        </w:rPr>
+        <w:t xml:space="preserve">: </w:t>
+      </w:r>
+      <w:r>
+        <w:rPr>
+          <w:rFonts w:ascii="Times New Roman" w:eastAsia="바탕" w:hAnsi="Times New Roman" w:cs="Times New Roman"/>
+          <w:sz w:val="18"/>
+          <w:szCs w:val="18"/>
+          <w:lang w:eastAsia="ko-KR"/>
+        </w:rPr>
+        <w:t>뉴비대전</w:t>
+      </w:r>
+      <w:r>
+        <w:rPr>
+          <w:rFonts w:ascii="Times New Roman" w:eastAsia="바탕" w:hAnsi="Times New Roman" w:cs="Times New Roman"/>
+          <w:sz w:val="18"/>
+          <w:szCs w:val="18"/>
+          <w:lang w:eastAsia="ko-KR"/>
+        </w:rPr>
+        <w:t>’</w:t>
+      </w:r>
+      <w:r>
+        <w:rPr>
+          <w:rFonts w:ascii="Times New Roman" w:eastAsia="바탕" w:hAnsi="Times New Roman" w:cs="Times New Roman"/>
+          <w:sz w:val="18"/>
+          <w:szCs w:val="18"/>
+          <w:lang w:eastAsia="ko-KR"/>
+        </w:rPr>
+        <w:t>을</w:t>
+      </w:r>
+      <w:r>
+        <w:rPr>
+          <w:rFonts w:ascii="Times New Roman" w:eastAsia="바탕" w:hAnsi="Times New Roman" w:cs="Times New Roman"/>
+          <w:sz w:val="18"/>
+          <w:szCs w:val="18"/>
+          <w:lang w:eastAsia="ko-KR"/>
+        </w:rPr>
+        <w:t xml:space="preserve"> </w:t>
+      </w:r>
+      <w:r>
+        <w:rPr>
+          <w:rFonts w:ascii="Times New Roman" w:eastAsia="바탕" w:hAnsi="Times New Roman" w:cs="Times New Roman"/>
+          <w:sz w:val="18"/>
+          <w:szCs w:val="18"/>
+          <w:lang w:eastAsia="ko-KR"/>
+        </w:rPr>
+        <w:t>단독</w:t>
+      </w:r>
+      <w:r>
+        <w:rPr>
+          <w:rFonts w:ascii="Times New Roman" w:eastAsia="바탕" w:hAnsi="Times New Roman" w:cs="Times New Roman"/>
+          <w:sz w:val="18"/>
+          <w:szCs w:val="18"/>
+          <w:lang w:eastAsia="ko-KR"/>
+        </w:rPr>
+        <w:t xml:space="preserve"> </w:t>
+      </w:r>
+      <w:r>
+        <w:rPr>
+          <w:rFonts w:ascii="Times New Roman" w:eastAsia="바탕" w:hAnsi="Times New Roman" w:cs="Times New Roman"/>
+          <w:sz w:val="18"/>
+          <w:szCs w:val="18"/>
+          <w:lang w:eastAsia="ko-KR"/>
+        </w:rPr>
+        <w:t>기획</w:t>
+      </w:r>
+      <w:r>
+        <w:rPr>
+          <w:rFonts w:ascii="Times New Roman" w:eastAsia="바탕" w:hAnsi="Times New Roman" w:cs="Times New Roman" w:hint="eastAsia"/>
+          <w:sz w:val="18"/>
+          <w:szCs w:val="18"/>
+          <w:lang w:eastAsia="ko-KR"/>
+        </w:rPr>
+        <w:t xml:space="preserve"> </w:t>
+      </w:r>
+      <w:r>
+        <w:rPr>
+          <w:rFonts w:ascii="Times New Roman" w:eastAsia="바탕" w:hAnsi="Times New Roman" w:cs="Times New Roman" w:hint="eastAsia"/>
+          <w:sz w:val="18"/>
+          <w:szCs w:val="18"/>
+          <w:lang w:eastAsia="ko-KR"/>
+        </w:rPr>
+        <w:t>및</w:t>
+      </w:r>
+      <w:r>
+        <w:rPr>
+          <w:rFonts w:ascii="Times New Roman" w:eastAsia="바탕" w:hAnsi="Times New Roman" w:cs="Times New Roman" w:hint="eastAsia"/>
+          <w:sz w:val="18"/>
+          <w:szCs w:val="18"/>
+          <w:lang w:eastAsia="ko-KR"/>
+        </w:rPr>
+        <w:t xml:space="preserve"> </w:t>
+      </w:r>
+      <w:r>
+        <w:rPr>
+          <w:rFonts w:ascii="Times New Roman" w:eastAsia="바탕" w:hAnsi="Times New Roman" w:cs="Times New Roman" w:hint="eastAsia"/>
+          <w:sz w:val="18"/>
+          <w:szCs w:val="18"/>
+          <w:lang w:eastAsia="ko-KR"/>
+        </w:rPr>
+        <w:t>운영으로</w:t>
+      </w:r>
+      <w:r>
+        <w:rPr>
+          <w:rFonts w:ascii="Times New Roman" w:eastAsia="바탕" w:hAnsi="Times New Roman" w:cs="Times New Roman" w:hint="eastAsia"/>
+          <w:sz w:val="18"/>
+          <w:szCs w:val="18"/>
+          <w:lang w:eastAsia="ko-KR"/>
+        </w:rPr>
+        <w:t xml:space="preserve"> </w:t>
+      </w:r>
+      <w:r>
+        <w:rPr>
+          <w:rFonts w:ascii="Times New Roman" w:eastAsia="바탕" w:hAnsi="Times New Roman" w:cs="Times New Roman" w:hint="eastAsia"/>
+          <w:sz w:val="18"/>
+          <w:szCs w:val="18"/>
+          <w:lang w:eastAsia="ko-KR"/>
+        </w:rPr>
+        <w:t>신규</w:t>
+      </w:r>
+      <w:r>
+        <w:rPr>
+          <w:rFonts w:ascii="Times New Roman" w:eastAsia="바탕" w:hAnsi="Times New Roman" w:cs="Times New Roman" w:hint="eastAsia"/>
+          <w:sz w:val="18"/>
+          <w:szCs w:val="18"/>
+          <w:lang w:eastAsia="ko-KR"/>
+        </w:rPr>
+        <w:t xml:space="preserve"> </w:t>
+      </w:r>
+      <w:r>
+        <w:rPr>
+          <w:rFonts w:ascii="Times New Roman" w:eastAsia="바탕" w:hAnsi="Times New Roman" w:cs="Times New Roman" w:hint="eastAsia"/>
+          <w:sz w:val="18"/>
+          <w:szCs w:val="18"/>
+          <w:lang w:eastAsia="ko-KR"/>
+        </w:rPr>
+        <w:t>유저</w:t>
+      </w:r>
+      <w:r>
+        <w:rPr>
+          <w:rFonts w:ascii="Times New Roman" w:eastAsia="바탕" w:hAnsi="Times New Roman" w:cs="Times New Roman" w:hint="eastAsia"/>
+          <w:sz w:val="18"/>
+          <w:szCs w:val="18"/>
+          <w:lang w:eastAsia="ko-KR"/>
+        </w:rPr>
+        <w:t xml:space="preserve"> </w:t>
+      </w:r>
+      <w:r>
+        <w:rPr>
+          <w:rFonts w:ascii="Times New Roman" w:eastAsia="바탕" w:hAnsi="Times New Roman" w:cs="Times New Roman" w:hint="eastAsia"/>
+          <w:sz w:val="18"/>
+          <w:szCs w:val="18"/>
+          <w:lang w:eastAsia="ko-KR"/>
+        </w:rPr>
+        <w:t>잔존율</w:t>
+      </w:r>
+      <w:r>
+        <w:rPr>
+          <w:rFonts w:ascii="Times New Roman" w:eastAsia="바탕" w:hAnsi="Times New Roman" w:cs="Times New Roman" w:hint="eastAsia"/>
+          <w:sz w:val="18"/>
+          <w:szCs w:val="18"/>
+          <w:lang w:eastAsia="ko-KR"/>
+        </w:rPr>
+        <w:t xml:space="preserve"> </w:t>
+      </w:r>
+      <w:r>
+        <w:rPr>
+          <w:rFonts w:ascii="Times New Roman" w:eastAsia="바탕" w:hAnsi="Times New Roman" w:cs="Times New Roman"/>
+          <w:sz w:val="18"/>
+          <w:szCs w:val="18"/>
+          <w:lang w:eastAsia="ko-KR"/>
+        </w:rPr>
+        <w:t>10%</w:t>
+      </w:r>
+      <w:r>
+        <w:rPr>
+          <w:rFonts w:ascii="Times New Roman" w:eastAsia="바탕" w:hAnsi="Times New Roman" w:cs="Times New Roman"/>
+          <w:sz w:val="18"/>
+          <w:szCs w:val="18"/>
+          <w:lang w:eastAsia="ko-KR"/>
+        </w:rPr>
+        <w:t>에서</w:t>
+      </w:r>
+      <w:r>
+        <w:rPr>
+          <w:rFonts w:ascii="Times New Roman" w:eastAsia="바탕" w:hAnsi="Times New Roman" w:cs="Times New Roman" w:hint="eastAsia"/>
+          <w:sz w:val="18"/>
+          <w:szCs w:val="18"/>
+          <w:lang w:eastAsia="ko-KR"/>
+        </w:rPr>
+        <w:t xml:space="preserve"> </w:t>
+      </w:r>
+      <w:r>
+        <w:rPr>
+          <w:rFonts w:ascii="Times New Roman" w:eastAsia="바탕" w:hAnsi="Times New Roman" w:cs="Times New Roman"/>
+          <w:sz w:val="18"/>
+          <w:szCs w:val="18"/>
+          <w:lang w:eastAsia="ko-KR"/>
+        </w:rPr>
+        <w:t>60%</w:t>
+      </w:r>
+      <w:r>
+        <w:rPr>
+          <w:rFonts w:ascii="Times New Roman" w:eastAsia="바탕" w:hAnsi="Times New Roman" w:cs="Times New Roman"/>
+          <w:sz w:val="18"/>
+          <w:szCs w:val="18"/>
+          <w:lang w:eastAsia="ko-KR"/>
+        </w:rPr>
+        <w:t>로</w:t>
+      </w:r>
+      <w:r>
+        <w:rPr>
+          <w:rFonts w:ascii="Times New Roman" w:eastAsia="바탕" w:hAnsi="Times New Roman" w:cs="Times New Roman" w:hint="eastAsia"/>
+          <w:sz w:val="18"/>
+          <w:szCs w:val="18"/>
+          <w:lang w:eastAsia="ko-KR"/>
+        </w:rPr>
+        <w:t xml:space="preserve"> </w:t>
+      </w:r>
+      <w:r>
+        <w:rPr>
+          <w:rFonts w:ascii="Times New Roman" w:eastAsia="바탕" w:hAnsi="Times New Roman" w:cs="Times New Roman" w:hint="eastAsia"/>
+          <w:sz w:val="18"/>
+          <w:szCs w:val="18"/>
+          <w:lang w:eastAsia="ko-KR"/>
+        </w:rPr>
+        <w:t>개선</w:t>
+      </w:r>
+      <w:r>
+        <w:rPr>
+          <w:rFonts w:ascii="Times New Roman" w:eastAsia="바탕" w:hAnsi="Times New Roman" w:cs="Times New Roman" w:hint="eastAsia"/>
           <w:sz w:val="18"/>
           <w:szCs w:val="18"/>
           <w:lang w:eastAsia="ko-KR"/>
@@ -9905,7 +9815,7 @@
 </file>
 
 <file path=customXml/itemProps1.xml><?xml version="1.0" encoding="utf-8"?>
-<ds:datastoreItem xmlns:ds="http://schemas.openxmlformats.org/officeDocument/2006/customXml" ds:itemID="{5B2CC8EB-6877-4C97-9EDE-774AB5E17D88}">
+<ds:datastoreItem xmlns:ds="http://schemas.openxmlformats.org/officeDocument/2006/customXml" ds:itemID="{3D19947B-F120-4102-9116-EC111F34FBA5}">
   <ds:schemaRefs>
     <ds:schemaRef ds:uri="http://schemas.openxmlformats.org/officeDocument/2006/bibliography"/>
   </ds:schemaRefs>

</xml_diff>